<commit_message>
Agregar el esquema del gestor como evidencia en el capitulo 6
La rubrica pide evidencia de funcionamiento de la base. Se agrega la captura
del esquema tal como lo muestra el panel de administracion, con las siete
tablas, sus tipos y sus relaciones.

El SVG que exporta Supabase usa foreignObject con HTML dentro, asi que ningun
renderizador de SVG corriente lo dibuja: se convirtio a PNG con un navegador
en modo headless, recortado al contenido.

La tabla 6.1 vuelve a listar las siete tablas, porque el capitulo documenta la
base real. Notificaciones sale del modelo del capitulo 5 —que describe el
diseno— y se explica en 6.2 por que aparece en uno y no en el otro.

Las figuras posteriores se renumeran: ahora son trece.

Co-Authored-By: Claude Opus 5 <noreply@anthropic.com>
</commit_message>
<xml_diff>
--- a/Documentacion/Avance_Biblioteca_2.docx
+++ b/Documentacion/Avance_Biblioteca_2.docx
@@ -7432,6 +7432,169 @@
           </w:p>
         </w:tc>
       </w:tr>
+      <w:tr>
+        <w:tc>
+          <w:tcPr>
+            <w:tcW w:type="dxa" w:w="1700"/>
+            <w:tcMar>
+              <w:top w:type="dxa" w:w="80"/>
+              <w:left w:type="dxa" w:w="120"/>
+              <w:bottom w:type="dxa" w:w="80"/>
+              <w:right w:type="dxa" w:w="120"/>
+            </w:tcMar>
+          </w:tcPr>
+          <w:p>
+            <w:pPr>
+              <w:spacing w:after="0" w:line="240"/>
+            </w:pPr>
+            <w:r>
+              <w:rPr>
+                <w:sz w:val="19"/>
+                <w:szCs w:val="19"/>
+              </w:rPr>
+              <w:t xml:space="preserve">notificaciones</w:t>
+            </w:r>
+          </w:p>
+        </w:tc>
+        <w:tc>
+          <w:tcPr>
+            <w:tcW w:type="dxa" w:w="1200"/>
+            <w:tcMar>
+              <w:top w:type="dxa" w:w="80"/>
+              <w:left w:type="dxa" w:w="120"/>
+              <w:bottom w:type="dxa" w:w="80"/>
+              <w:right w:type="dxa" w:w="120"/>
+            </w:tcMar>
+          </w:tcPr>
+          <w:p>
+            <w:pPr>
+              <w:spacing w:after="0" w:line="240"/>
+            </w:pPr>
+            <w:r>
+              <w:rPr>
+                <w:sz w:val="19"/>
+                <w:szCs w:val="19"/>
+              </w:rPr>
+              <w:t xml:space="preserve">9</w:t>
+            </w:r>
+          </w:p>
+        </w:tc>
+        <w:tc>
+          <w:tcPr>
+            <w:tcW w:type="dxa" w:w="1500"/>
+            <w:tcMar>
+              <w:top w:type="dxa" w:w="80"/>
+              <w:left w:type="dxa" w:w="120"/>
+              <w:bottom w:type="dxa" w:w="80"/>
+              <w:right w:type="dxa" w:w="120"/>
+            </w:tcMar>
+          </w:tcPr>
+          <w:p>
+            <w:pPr>
+              <w:spacing w:after="0" w:line="240"/>
+            </w:pPr>
+            <w:r>
+              <w:rPr>
+                <w:sz w:val="19"/>
+                <w:szCs w:val="19"/>
+              </w:rPr>
+              <w:t xml:space="preserve">2</w:t>
+            </w:r>
+          </w:p>
+        </w:tc>
+        <w:tc>
+          <w:tcPr>
+            <w:tcW w:type="dxa" w:w="1500"/>
+            <w:tcMar>
+              <w:top w:type="dxa" w:w="80"/>
+              <w:left w:type="dxa" w:w="120"/>
+              <w:bottom w:type="dxa" w:w="80"/>
+              <w:right w:type="dxa" w:w="120"/>
+            </w:tcMar>
+          </w:tcPr>
+          <w:p>
+            <w:pPr>
+              <w:spacing w:after="0" w:line="240"/>
+            </w:pPr>
+            <w:r>
+              <w:rPr>
+                <w:sz w:val="19"/>
+                <w:szCs w:val="19"/>
+              </w:rPr>
+              <w:t xml:space="preserve">7</w:t>
+            </w:r>
+          </w:p>
+        </w:tc>
+        <w:tc>
+          <w:tcPr>
+            <w:tcW w:type="dxa" w:w="1800"/>
+            <w:tcMar>
+              <w:top w:type="dxa" w:w="80"/>
+              <w:left w:type="dxa" w:w="120"/>
+              <w:bottom w:type="dxa" w:w="80"/>
+              <w:right w:type="dxa" w:w="120"/>
+            </w:tcMar>
+          </w:tcPr>
+          <w:p>
+            <w:pPr>
+              <w:spacing w:after="0" w:line="240"/>
+            </w:pPr>
+            <w:r>
+              <w:rPr>
+                <w:sz w:val="19"/>
+                <w:szCs w:val="19"/>
+              </w:rPr>
+              <w:t xml:space="preserve">2</w:t>
+            </w:r>
+          </w:p>
+        </w:tc>
+        <w:tc>
+          <w:tcPr>
+            <w:tcW w:type="dxa" w:w="1560"/>
+            <w:tcMar>
+              <w:top w:type="dxa" w:w="80"/>
+              <w:left w:type="dxa" w:w="120"/>
+              <w:bottom w:type="dxa" w:w="80"/>
+              <w:right w:type="dxa" w:w="120"/>
+            </w:tcMar>
+          </w:tcPr>
+          <w:p>
+            <w:pPr>
+              <w:spacing w:after="0" w:line="240"/>
+            </w:pPr>
+            <w:r>
+              <w:rPr>
+                <w:sz w:val="19"/>
+                <w:szCs w:val="19"/>
+              </w:rPr>
+              <w:t xml:space="preserve">0</w:t>
+            </w:r>
+          </w:p>
+        </w:tc>
+        <w:tc>
+          <w:tcPr>
+            <w:tcW w:type="dxa" w:w="1100"/>
+            <w:tcMar>
+              <w:top w:type="dxa" w:w="80"/>
+              <w:left w:type="dxa" w:w="120"/>
+              <w:bottom w:type="dxa" w:w="80"/>
+              <w:right w:type="dxa" w:w="120"/>
+            </w:tcMar>
+          </w:tcPr>
+          <w:p>
+            <w:pPr>
+              <w:spacing w:after="0" w:line="240"/>
+            </w:pPr>
+            <w:r>
+              <w:rPr>
+                <w:sz w:val="19"/>
+                <w:szCs w:val="19"/>
+              </w:rPr>
+              <w:t xml:space="preserve">0</w:t>
+            </w:r>
+          </w:p>
+        </w:tc>
+      </w:tr>
     </w:tbl>
     <w:p>
       <w:pPr>
@@ -7458,7 +7621,7 @@
           <w:sz w:val="22"/>
           <w:szCs w:val="22"/>
         </w:rPr>
-        <w:t xml:space="preserve">La bitácora de trazabilidad aparece sin filas porque su estructura está creada y el disparador que debe escribir en ella corresponde a la siguiente iteración.</w:t>
+        <w:t xml:space="preserve">Las dos tablas sin filas tienen su estructura creada y la funcionalidad que las usa corresponde a la siguiente iteración: la bitácora necesita el disparador que escriba en ella, y el registro de avisos, la vía de notificación que la escuela acuerde.</w:t>
       </w:r>
     </w:p>
     <w:p>
@@ -7467,7 +7630,7 @@
         <w:spacing w:after="140" w:before="280"/>
       </w:pPr>
       <w:r>
-        <w:t xml:space="preserve">6.2 Integridad referencial</w:t>
+        <w:t xml:space="preserve">6.2 El esquema en el gestor</w:t>
       </w:r>
     </w:p>
     <w:p>
@@ -7479,1809 +7642,7 @@
           <w:sz w:val="22"/>
           <w:szCs w:val="22"/>
         </w:rPr>
-        <w:t xml:space="preserve">Las claves foráneas de los préstamos usan restricción, no borrado en cascada. Es deliberado: borrar un alumno o un libro en cascada se llevaría su historial de préstamos, que es justo lo que el requisito de conservación permanente prohíbe. El sistema anterior lo hacía en cascada y por eso perdía el historial.</w:t>
-      </w:r>
-    </w:p>
-    <w:p>
-      <w:pPr>
-        <w:spacing w:after="120" w:line="276"/>
-      </w:pPr>
-      <w:r>
-        <w:rPr>
-          <w:sz w:val="22"/>
-          <w:szCs w:val="22"/>
-        </w:rPr>
-        <w:t xml:space="preserve">Las restricciones de comprobación cubren lo que el dominio no admite: existencias no negativas, páginas positivas, grado entre uno y seis, año de publicación no futuro, y coherencia entre el estado de un préstamo y su fecha de devolución.</w:t>
-      </w:r>
-    </w:p>
-    <w:p>
-      <w:pPr>
-        <w:pStyle w:val="Heading2"/>
-        <w:spacing w:after="140" w:before="280"/>
-      </w:pPr>
-      <w:r>
-        <w:t xml:space="preserve">6.3 Control de acceso</w:t>
-      </w:r>
-    </w:p>
-    <w:p>
-      <w:pPr>
-        <w:spacing w:after="120" w:line="276"/>
-      </w:pPr>
-      <w:r>
-        <w:rPr>
-          <w:sz w:val="22"/>
-          <w:szCs w:val="22"/>
-        </w:rPr>
-        <w:t xml:space="preserve">Las siete tablas tienen activada la seguridad a nivel de fila, con dieciséis políticas. El personal de la biblioteca alcanza los registros que necesita para operar; un alumno autenticado solo alcanza su propio perfil y sus propios préstamos. Se verificó con una cuenta real de cada perfil.</w:t>
-      </w:r>
-    </w:p>
-    <w:p>
-      <w:pPr>
-        <w:spacing w:after="120" w:line="276"/>
-      </w:pPr>
-      <w:r>
-        <w:rPr>
-          <w:sz w:val="22"/>
-          <w:szCs w:val="22"/>
-        </w:rPr>
-        <w:t xml:space="preserve">El control vive en la base y no en la interfaz, por una razón concreta: la llave de acceso que viaja dentro de la aplicación es pública por diseño, así que cualquier regla que viviera solo en el cliente podría saltarse llamando la interfaz de programación directamente.</w:t>
-      </w:r>
-    </w:p>
-    <w:p>
-      <w:pPr>
-        <w:pStyle w:val="Heading2"/>
-        <w:spacing w:after="140" w:before="280"/>
-      </w:pPr>
-      <w:r>
-        <w:t xml:space="preserve">6.4 Evidencia de funcionamiento y datos de prueba</w:t>
-      </w:r>
-    </w:p>
-    <w:p>
-      <w:pPr>
-        <w:spacing w:after="120" w:line="276"/>
-      </w:pPr>
-      <w:r>
-        <w:rPr>
-          <w:sz w:val="22"/>
-          <w:szCs w:val="22"/>
-        </w:rPr>
-        <w:t xml:space="preserve">La base contiene un juego de datos apropiado para una biblioteca escolar: once libros, seis alumnos, dos empleados y siete préstamos, de los cuales cuatro están vencidos a propósito para que el reporte de deudores tenga qué mostrar.</w:t>
-      </w:r>
-    </w:p>
-    <w:p>
-      <w:pPr>
-        <w:spacing w:after="120" w:line="276"/>
-      </w:pPr>
-      <w:r>
-        <w:rPr>
-          <w:sz w:val="22"/>
-          <w:szCs w:val="22"/>
-        </w:rPr>
-        <w:t xml:space="preserve">El funcionamiento se comprobó ejecutando las reglas contra la base real, dentro de transacciones que se revierten para no alterar los datos:</w:t>
-      </w:r>
-    </w:p>
-    <w:p>
-      <w:pPr>
-        <w:spacing w:after="160" w:line="276"/>
-      </w:pPr>
-      <w:r>
-        <w:rPr>
-          <w:sz w:val="22"/>
-          <w:szCs w:val="22"/>
-        </w:rPr>
-        <w:t xml:space="preserve"/>
-      </w:r>
-    </w:p>
-    <w:tbl>
-      <w:tblPr>
-        <w:tblW w:type="dxa" w:w="9360"/>
-        <w:tblBorders>
-          <w:top w:val="single" w:color="auto" w:sz="4"/>
-          <w:left w:val="single" w:color="auto" w:sz="4"/>
-          <w:bottom w:val="single" w:color="auto" w:sz="4"/>
-          <w:right w:val="single" w:color="auto" w:sz="4"/>
-          <w:insideH w:val="single" w:color="auto" w:sz="4"/>
-          <w:insideV w:val="single" w:color="auto" w:sz="4"/>
-        </w:tblBorders>
-      </w:tblPr>
-      <w:tblGrid>
-        <w:gridCol w:w="3100"/>
-        <w:gridCol w:w="2900"/>
-        <w:gridCol w:w="3360"/>
-      </w:tblGrid>
-      <w:tr>
-        <w:trPr>
-          <w:tblHeader/>
-        </w:trPr>
-        <w:tc>
-          <w:tcPr>
-            <w:tcW w:type="dxa" w:w="3100"/>
-            <w:shd w:fill="E7EBF1" w:val="clear"/>
-            <w:tcMar>
-              <w:top w:type="dxa" w:w="80"/>
-              <w:left w:type="dxa" w:w="120"/>
-              <w:bottom w:type="dxa" w:w="80"/>
-              <w:right w:type="dxa" w:w="120"/>
-            </w:tcMar>
-          </w:tcPr>
-          <w:p>
-            <w:pPr>
-              <w:spacing w:after="0" w:line="240"/>
-            </w:pPr>
-            <w:r>
-              <w:rPr>
-                <w:b/>
-                <w:bCs/>
-                <w:color w:val="2D4B73"/>
-                <w:sz w:val="19"/>
-                <w:szCs w:val="19"/>
-              </w:rPr>
-              <w:t xml:space="preserve">Comprobación</w:t>
-            </w:r>
-          </w:p>
-        </w:tc>
-        <w:tc>
-          <w:tcPr>
-            <w:tcW w:type="dxa" w:w="2900"/>
-            <w:shd w:fill="E7EBF1" w:val="clear"/>
-            <w:tcMar>
-              <w:top w:type="dxa" w:w="80"/>
-              <w:left w:type="dxa" w:w="120"/>
-              <w:bottom w:type="dxa" w:w="80"/>
-              <w:right w:type="dxa" w:w="120"/>
-            </w:tcMar>
-          </w:tcPr>
-          <w:p>
-            <w:pPr>
-              <w:spacing w:after="0" w:line="240"/>
-            </w:pPr>
-            <w:r>
-              <w:rPr>
-                <w:b/>
-                <w:bCs/>
-                <w:color w:val="2D4B73"/>
-                <w:sz w:val="19"/>
-                <w:szCs w:val="19"/>
-              </w:rPr>
-              <w:t xml:space="preserve">Resultado esperado</w:t>
-            </w:r>
-          </w:p>
-        </w:tc>
-        <w:tc>
-          <w:tcPr>
-            <w:tcW w:type="dxa" w:w="3360"/>
-            <w:shd w:fill="E7EBF1" w:val="clear"/>
-            <w:tcMar>
-              <w:top w:type="dxa" w:w="80"/>
-              <w:left w:type="dxa" w:w="120"/>
-              <w:bottom w:type="dxa" w:w="80"/>
-              <w:right w:type="dxa" w:w="120"/>
-            </w:tcMar>
-          </w:tcPr>
-          <w:p>
-            <w:pPr>
-              <w:spacing w:after="0" w:line="240"/>
-            </w:pPr>
-            <w:r>
-              <w:rPr>
-                <w:b/>
-                <w:bCs/>
-                <w:color w:val="2D4B73"/>
-                <w:sz w:val="19"/>
-                <w:szCs w:val="19"/>
-              </w:rPr>
-              <w:t xml:space="preserve">Resultado obtenido</w:t>
-            </w:r>
-          </w:p>
-        </w:tc>
-      </w:tr>
-      <w:tr>
-        <w:tc>
-          <w:tcPr>
-            <w:tcW w:type="dxa" w:w="3100"/>
-            <w:tcMar>
-              <w:top w:type="dxa" w:w="80"/>
-              <w:left w:type="dxa" w:w="120"/>
-              <w:bottom w:type="dxa" w:w="80"/>
-              <w:right w:type="dxa" w:w="120"/>
-            </w:tcMar>
-          </w:tcPr>
-          <w:p>
-            <w:pPr>
-              <w:spacing w:after="0" w:line="240"/>
-            </w:pPr>
-            <w:r>
-              <w:rPr>
-                <w:sz w:val="19"/>
-                <w:szCs w:val="19"/>
-              </w:rPr>
-              <w:t xml:space="preserve">Registrar un préstamo</w:t>
-            </w:r>
-          </w:p>
-        </w:tc>
-        <w:tc>
-          <w:tcPr>
-            <w:tcW w:type="dxa" w:w="2900"/>
-            <w:tcMar>
-              <w:top w:type="dxa" w:w="80"/>
-              <w:left w:type="dxa" w:w="120"/>
-              <w:bottom w:type="dxa" w:w="80"/>
-              <w:right w:type="dxa" w:w="120"/>
-            </w:tcMar>
-          </w:tcPr>
-          <w:p>
-            <w:pPr>
-              <w:spacing w:after="0" w:line="240"/>
-            </w:pPr>
-            <w:r>
-              <w:rPr>
-                <w:sz w:val="19"/>
-                <w:szCs w:val="19"/>
-              </w:rPr>
-              <w:t xml:space="preserve">Una unidad menos en existencias</w:t>
-            </w:r>
-          </w:p>
-        </w:tc>
-        <w:tc>
-          <w:tcPr>
-            <w:tcW w:type="dxa" w:w="3360"/>
-            <w:tcMar>
-              <w:top w:type="dxa" w:w="80"/>
-              <w:left w:type="dxa" w:w="120"/>
-              <w:bottom w:type="dxa" w:w="80"/>
-              <w:right w:type="dxa" w:w="120"/>
-            </w:tcMar>
-          </w:tcPr>
-          <w:p>
-            <w:pPr>
-              <w:spacing w:after="0" w:line="240"/>
-            </w:pPr>
-            <w:r>
-              <w:rPr>
-                <w:sz w:val="19"/>
-                <w:szCs w:val="19"/>
-              </w:rPr>
-              <w:t xml:space="preserve">3 → 2</w:t>
-            </w:r>
-          </w:p>
-        </w:tc>
-      </w:tr>
-      <w:tr>
-        <w:tc>
-          <w:tcPr>
-            <w:tcW w:type="dxa" w:w="3100"/>
-            <w:tcMar>
-              <w:top w:type="dxa" w:w="80"/>
-              <w:left w:type="dxa" w:w="120"/>
-              <w:bottom w:type="dxa" w:w="80"/>
-              <w:right w:type="dxa" w:w="120"/>
-            </w:tcMar>
-          </w:tcPr>
-          <w:p>
-            <w:pPr>
-              <w:spacing w:after="0" w:line="240"/>
-            </w:pPr>
-            <w:r>
-              <w:rPr>
-                <w:sz w:val="19"/>
-                <w:szCs w:val="19"/>
-              </w:rPr>
-              <w:t xml:space="preserve">Registrar la devolución</w:t>
-            </w:r>
-          </w:p>
-        </w:tc>
-        <w:tc>
-          <w:tcPr>
-            <w:tcW w:type="dxa" w:w="2900"/>
-            <w:tcMar>
-              <w:top w:type="dxa" w:w="80"/>
-              <w:left w:type="dxa" w:w="120"/>
-              <w:bottom w:type="dxa" w:w="80"/>
-              <w:right w:type="dxa" w:w="120"/>
-            </w:tcMar>
-          </w:tcPr>
-          <w:p>
-            <w:pPr>
-              <w:spacing w:after="0" w:line="240"/>
-            </w:pPr>
-            <w:r>
-              <w:rPr>
-                <w:sz w:val="19"/>
-                <w:szCs w:val="19"/>
-              </w:rPr>
-              <w:t xml:space="preserve">La unidad vuelve al inventario</w:t>
-            </w:r>
-          </w:p>
-        </w:tc>
-        <w:tc>
-          <w:tcPr>
-            <w:tcW w:type="dxa" w:w="3360"/>
-            <w:tcMar>
-              <w:top w:type="dxa" w:w="80"/>
-              <w:left w:type="dxa" w:w="120"/>
-              <w:bottom w:type="dxa" w:w="80"/>
-              <w:right w:type="dxa" w:w="120"/>
-            </w:tcMar>
-          </w:tcPr>
-          <w:p>
-            <w:pPr>
-              <w:spacing w:after="0" w:line="240"/>
-            </w:pPr>
-            <w:r>
-              <w:rPr>
-                <w:sz w:val="19"/>
-                <w:szCs w:val="19"/>
-              </w:rPr>
-              <w:t xml:space="preserve">2 → 3</w:t>
-            </w:r>
-          </w:p>
-        </w:tc>
-      </w:tr>
-      <w:tr>
-        <w:tc>
-          <w:tcPr>
-            <w:tcW w:type="dxa" w:w="3100"/>
-            <w:tcMar>
-              <w:top w:type="dxa" w:w="80"/>
-              <w:left w:type="dxa" w:w="120"/>
-              <w:bottom w:type="dxa" w:w="80"/>
-              <w:right w:type="dxa" w:w="120"/>
-            </w:tcMar>
-          </w:tcPr>
-          <w:p>
-            <w:pPr>
-              <w:spacing w:after="0" w:line="240"/>
-            </w:pPr>
-            <w:r>
-              <w:rPr>
-                <w:sz w:val="19"/>
-                <w:szCs w:val="19"/>
-              </w:rPr>
-              <w:t xml:space="preserve">Reabrir el préstamo devuelto</w:t>
-            </w:r>
-          </w:p>
-        </w:tc>
-        <w:tc>
-          <w:tcPr>
-            <w:tcW w:type="dxa" w:w="2900"/>
-            <w:tcMar>
-              <w:top w:type="dxa" w:w="80"/>
-              <w:left w:type="dxa" w:w="120"/>
-              <w:bottom w:type="dxa" w:w="80"/>
-              <w:right w:type="dxa" w:w="120"/>
-            </w:tcMar>
-          </w:tcPr>
-          <w:p>
-            <w:pPr>
-              <w:spacing w:after="0" w:line="240"/>
-            </w:pPr>
-            <w:r>
-              <w:rPr>
-                <w:sz w:val="19"/>
-                <w:szCs w:val="19"/>
-              </w:rPr>
-              <w:t xml:space="preserve">Vuelve a salir del inventario</w:t>
-            </w:r>
-          </w:p>
-        </w:tc>
-        <w:tc>
-          <w:tcPr>
-            <w:tcW w:type="dxa" w:w="3360"/>
-            <w:tcMar>
-              <w:top w:type="dxa" w:w="80"/>
-              <w:left w:type="dxa" w:w="120"/>
-              <w:bottom w:type="dxa" w:w="80"/>
-              <w:right w:type="dxa" w:w="120"/>
-            </w:tcMar>
-          </w:tcPr>
-          <w:p>
-            <w:pPr>
-              <w:spacing w:after="0" w:line="240"/>
-            </w:pPr>
-            <w:r>
-              <w:rPr>
-                <w:sz w:val="19"/>
-                <w:szCs w:val="19"/>
-              </w:rPr>
-              <w:t xml:space="preserve">3 → 2</w:t>
-            </w:r>
-          </w:p>
-        </w:tc>
-      </w:tr>
-      <w:tr>
-        <w:tc>
-          <w:tcPr>
-            <w:tcW w:type="dxa" w:w="3100"/>
-            <w:tcMar>
-              <w:top w:type="dxa" w:w="80"/>
-              <w:left w:type="dxa" w:w="120"/>
-              <w:bottom w:type="dxa" w:w="80"/>
-              <w:right w:type="dxa" w:w="120"/>
-            </w:tcMar>
-          </w:tcPr>
-          <w:p>
-            <w:pPr>
-              <w:spacing w:after="0" w:line="240"/>
-            </w:pPr>
-            <w:r>
-              <w:rPr>
-                <w:sz w:val="19"/>
-                <w:szCs w:val="19"/>
-              </w:rPr>
-              <w:t xml:space="preserve">Borrar un préstamo abierto</w:t>
-            </w:r>
-          </w:p>
-        </w:tc>
-        <w:tc>
-          <w:tcPr>
-            <w:tcW w:type="dxa" w:w="2900"/>
-            <w:tcMar>
-              <w:top w:type="dxa" w:w="80"/>
-              <w:left w:type="dxa" w:w="120"/>
-              <w:bottom w:type="dxa" w:w="80"/>
-              <w:right w:type="dxa" w:w="120"/>
-            </w:tcMar>
-          </w:tcPr>
-          <w:p>
-            <w:pPr>
-              <w:spacing w:after="0" w:line="240"/>
-            </w:pPr>
-            <w:r>
-              <w:rPr>
-                <w:sz w:val="19"/>
-                <w:szCs w:val="19"/>
-              </w:rPr>
-              <w:t xml:space="preserve">El ejemplar se reintegra</w:t>
-            </w:r>
-          </w:p>
-        </w:tc>
-        <w:tc>
-          <w:tcPr>
-            <w:tcW w:type="dxa" w:w="3360"/>
-            <w:tcMar>
-              <w:top w:type="dxa" w:w="80"/>
-              <w:left w:type="dxa" w:w="120"/>
-              <w:bottom w:type="dxa" w:w="80"/>
-              <w:right w:type="dxa" w:w="120"/>
-            </w:tcMar>
-          </w:tcPr>
-          <w:p>
-            <w:pPr>
-              <w:spacing w:after="0" w:line="240"/>
-            </w:pPr>
-            <w:r>
-              <w:rPr>
-                <w:sz w:val="19"/>
-                <w:szCs w:val="19"/>
-              </w:rPr>
-              <w:t xml:space="preserve">2 → 3</w:t>
-            </w:r>
-          </w:p>
-        </w:tc>
-      </w:tr>
-      <w:tr>
-        <w:tc>
-          <w:tcPr>
-            <w:tcW w:type="dxa" w:w="3100"/>
-            <w:tcMar>
-              <w:top w:type="dxa" w:w="80"/>
-              <w:left w:type="dxa" w:w="120"/>
-              <w:bottom w:type="dxa" w:w="80"/>
-              <w:right w:type="dxa" w:w="120"/>
-            </w:tcMar>
-          </w:tcPr>
-          <w:p>
-            <w:pPr>
-              <w:spacing w:after="0" w:line="240"/>
-            </w:pPr>
-            <w:r>
-              <w:rPr>
-                <w:sz w:val="19"/>
-                <w:szCs w:val="19"/>
-              </w:rPr>
-              <w:t xml:space="preserve">Enviar una fecha límite falsa (año 2099)</w:t>
-            </w:r>
-          </w:p>
-        </w:tc>
-        <w:tc>
-          <w:tcPr>
-            <w:tcW w:type="dxa" w:w="2900"/>
-            <w:tcMar>
-              <w:top w:type="dxa" w:w="80"/>
-              <w:left w:type="dxa" w:w="120"/>
-              <w:bottom w:type="dxa" w:w="80"/>
-              <w:right w:type="dxa" w:w="120"/>
-            </w:tcMar>
-          </w:tcPr>
-          <w:p>
-            <w:pPr>
-              <w:spacing w:after="0" w:line="240"/>
-            </w:pPr>
-            <w:r>
-              <w:rPr>
-                <w:sz w:val="19"/>
-                <w:szCs w:val="19"/>
-              </w:rPr>
-              <w:t xml:space="preserve">La base impone siete días</w:t>
-            </w:r>
-          </w:p>
-        </w:tc>
-        <w:tc>
-          <w:tcPr>
-            <w:tcW w:type="dxa" w:w="3360"/>
-            <w:tcMar>
-              <w:top w:type="dxa" w:w="80"/>
-              <w:left w:type="dxa" w:w="120"/>
-              <w:bottom w:type="dxa" w:w="80"/>
-              <w:right w:type="dxa" w:w="120"/>
-            </w:tcMar>
-          </w:tcPr>
-          <w:p>
-            <w:pPr>
-              <w:spacing w:after="0" w:line="240"/>
-            </w:pPr>
-            <w:r>
-              <w:rPr>
-                <w:sz w:val="19"/>
-                <w:szCs w:val="19"/>
-              </w:rPr>
-              <w:t xml:space="preserve">Guardó el 29/09/2026</w:t>
-            </w:r>
-          </w:p>
-        </w:tc>
-      </w:tr>
-      <w:tr>
-        <w:tc>
-          <w:tcPr>
-            <w:tcW w:type="dxa" w:w="3100"/>
-            <w:tcMar>
-              <w:top w:type="dxa" w:w="80"/>
-              <w:left w:type="dxa" w:w="120"/>
-              <w:bottom w:type="dxa" w:w="80"/>
-              <w:right w:type="dxa" w:w="120"/>
-            </w:tcMar>
-          </w:tcPr>
-          <w:p>
-            <w:pPr>
-              <w:spacing w:after="0" w:line="240"/>
-            </w:pPr>
-            <w:r>
-              <w:rPr>
-                <w:sz w:val="19"/>
-                <w:szCs w:val="19"/>
-              </w:rPr>
-              <w:t xml:space="preserve">Prestar a quien ya tiene un préstamo</w:t>
-            </w:r>
-          </w:p>
-        </w:tc>
-        <w:tc>
-          <w:tcPr>
-            <w:tcW w:type="dxa" w:w="2900"/>
-            <w:tcMar>
-              <w:top w:type="dxa" w:w="80"/>
-              <w:left w:type="dxa" w:w="120"/>
-              <w:bottom w:type="dxa" w:w="80"/>
-              <w:right w:type="dxa" w:w="120"/>
-            </w:tcMar>
-          </w:tcPr>
-          <w:p>
-            <w:pPr>
-              <w:spacing w:after="0" w:line="240"/>
-            </w:pPr>
-            <w:r>
-              <w:rPr>
-                <w:sz w:val="19"/>
-                <w:szCs w:val="19"/>
-              </w:rPr>
-              <w:t xml:space="preserve">Rechazo con mensaje propio</w:t>
-            </w:r>
-          </w:p>
-        </w:tc>
-        <w:tc>
-          <w:tcPr>
-            <w:tcW w:type="dxa" w:w="3360"/>
-            <w:tcMar>
-              <w:top w:type="dxa" w:w="80"/>
-              <w:left w:type="dxa" w:w="120"/>
-              <w:bottom w:type="dxa" w:w="80"/>
-              <w:right w:type="dxa" w:w="120"/>
-            </w:tcMar>
-          </w:tcPr>
-          <w:p>
-            <w:pPr>
-              <w:spacing w:after="0" w:line="240"/>
-            </w:pPr>
-            <w:r>
-              <w:rPr>
-                <w:sz w:val="19"/>
-                <w:szCs w:val="19"/>
-              </w:rPr>
-              <w:t xml:space="preserve">«Este alumno ya tiene un préstamo activo»</w:t>
-            </w:r>
-          </w:p>
-        </w:tc>
-      </w:tr>
-      <w:tr>
-        <w:tc>
-          <w:tcPr>
-            <w:tcW w:type="dxa" w:w="3100"/>
-            <w:tcMar>
-              <w:top w:type="dxa" w:w="80"/>
-              <w:left w:type="dxa" w:w="120"/>
-              <w:bottom w:type="dxa" w:w="80"/>
-              <w:right w:type="dxa" w:w="120"/>
-            </w:tcMar>
-          </w:tcPr>
-          <w:p>
-            <w:pPr>
-              <w:spacing w:after="0" w:line="240"/>
-            </w:pPr>
-            <w:r>
-              <w:rPr>
-                <w:sz w:val="19"/>
-                <w:szCs w:val="19"/>
-              </w:rPr>
-              <w:t xml:space="preserve">Bibliotecario crea un administrador</w:t>
-            </w:r>
-          </w:p>
-        </w:tc>
-        <w:tc>
-          <w:tcPr>
-            <w:tcW w:type="dxa" w:w="2900"/>
-            <w:tcMar>
-              <w:top w:type="dxa" w:w="80"/>
-              <w:left w:type="dxa" w:w="120"/>
-              <w:bottom w:type="dxa" w:w="80"/>
-              <w:right w:type="dxa" w:w="120"/>
-            </w:tcMar>
-          </w:tcPr>
-          <w:p>
-            <w:pPr>
-              <w:spacing w:after="0" w:line="240"/>
-            </w:pPr>
-            <w:r>
-              <w:rPr>
-                <w:sz w:val="19"/>
-                <w:szCs w:val="19"/>
-              </w:rPr>
-              <w:t xml:space="preserve">Rechazo</w:t>
-            </w:r>
-          </w:p>
-        </w:tc>
-        <w:tc>
-          <w:tcPr>
-            <w:tcW w:type="dxa" w:w="3360"/>
-            <w:tcMar>
-              <w:top w:type="dxa" w:w="80"/>
-              <w:left w:type="dxa" w:w="120"/>
-              <w:bottom w:type="dxa" w:w="80"/>
-              <w:right w:type="dxa" w:w="120"/>
-            </w:tcMar>
-          </w:tcPr>
-          <w:p>
-            <w:pPr>
-              <w:spacing w:after="0" w:line="240"/>
-            </w:pPr>
-            <w:r>
-              <w:rPr>
-                <w:sz w:val="19"/>
-                <w:szCs w:val="19"/>
-              </w:rPr>
-              <w:t xml:space="preserve">«Solo un administrador puede registrar a otro administrador»</w:t>
-            </w:r>
-          </w:p>
-        </w:tc>
-      </w:tr>
-      <w:tr>
-        <w:tc>
-          <w:tcPr>
-            <w:tcW w:type="dxa" w:w="3100"/>
-            <w:tcMar>
-              <w:top w:type="dxa" w:w="80"/>
-              <w:left w:type="dxa" w:w="120"/>
-              <w:bottom w:type="dxa" w:w="80"/>
-              <w:right w:type="dxa" w:w="120"/>
-            </w:tcMar>
-          </w:tcPr>
-          <w:p>
-            <w:pPr>
-              <w:spacing w:after="0" w:line="240"/>
-            </w:pPr>
-            <w:r>
-              <w:rPr>
-                <w:sz w:val="19"/>
-                <w:szCs w:val="19"/>
-              </w:rPr>
-              <w:t xml:space="preserve">Administrador cambia su propio perfil</w:t>
-            </w:r>
-          </w:p>
-        </w:tc>
-        <w:tc>
-          <w:tcPr>
-            <w:tcW w:type="dxa" w:w="2900"/>
-            <w:tcMar>
-              <w:top w:type="dxa" w:w="80"/>
-              <w:left w:type="dxa" w:w="120"/>
-              <w:bottom w:type="dxa" w:w="80"/>
-              <w:right w:type="dxa" w:w="120"/>
-            </w:tcMar>
-          </w:tcPr>
-          <w:p>
-            <w:pPr>
-              <w:spacing w:after="0" w:line="240"/>
-            </w:pPr>
-            <w:r>
-              <w:rPr>
-                <w:sz w:val="19"/>
-                <w:szCs w:val="19"/>
-              </w:rPr>
-              <w:t xml:space="preserve">Rechazo</w:t>
-            </w:r>
-          </w:p>
-        </w:tc>
-        <w:tc>
-          <w:tcPr>
-            <w:tcW w:type="dxa" w:w="3360"/>
-            <w:tcMar>
-              <w:top w:type="dxa" w:w="80"/>
-              <w:left w:type="dxa" w:w="120"/>
-              <w:bottom w:type="dxa" w:w="80"/>
-              <w:right w:type="dxa" w:w="120"/>
-            </w:tcMar>
-          </w:tcPr>
-          <w:p>
-            <w:pPr>
-              <w:spacing w:after="0" w:line="240"/>
-            </w:pPr>
-            <w:r>
-              <w:rPr>
-                <w:sz w:val="19"/>
-                <w:szCs w:val="19"/>
-              </w:rPr>
-              <w:t xml:space="preserve">«No puedes cambiar tu propio perfil de acceso»</w:t>
-            </w:r>
-          </w:p>
-        </w:tc>
-      </w:tr>
-      <w:tr>
-        <w:tc>
-          <w:tcPr>
-            <w:tcW w:type="dxa" w:w="3100"/>
-            <w:tcMar>
-              <w:top w:type="dxa" w:w="80"/>
-              <w:left w:type="dxa" w:w="120"/>
-              <w:bottom w:type="dxa" w:w="80"/>
-              <w:right w:type="dxa" w:w="120"/>
-            </w:tcMar>
-          </w:tcPr>
-          <w:p>
-            <w:pPr>
-              <w:spacing w:after="0" w:line="240"/>
-            </w:pPr>
-            <w:r>
-              <w:rPr>
-                <w:sz w:val="19"/>
-                <w:szCs w:val="19"/>
-              </w:rPr>
-              <w:t xml:space="preserve">Bibliotecario registra a un bibliotecario</w:t>
-            </w:r>
-          </w:p>
-        </w:tc>
-        <w:tc>
-          <w:tcPr>
-            <w:tcW w:type="dxa" w:w="2900"/>
-            <w:tcMar>
-              <w:top w:type="dxa" w:w="80"/>
-              <w:left w:type="dxa" w:w="120"/>
-              <w:bottom w:type="dxa" w:w="80"/>
-              <w:right w:type="dxa" w:w="120"/>
-            </w:tcMar>
-          </w:tcPr>
-          <w:p>
-            <w:pPr>
-              <w:spacing w:after="0" w:line="240"/>
-            </w:pPr>
-            <w:r>
-              <w:rPr>
-                <w:sz w:val="19"/>
-                <w:szCs w:val="19"/>
-              </w:rPr>
-              <w:t xml:space="preserve">Permitido</w:t>
-            </w:r>
-          </w:p>
-        </w:tc>
-        <w:tc>
-          <w:tcPr>
-            <w:tcW w:type="dxa" w:w="3360"/>
-            <w:tcMar>
-              <w:top w:type="dxa" w:w="80"/>
-              <w:left w:type="dxa" w:w="120"/>
-              <w:bottom w:type="dxa" w:w="80"/>
-              <w:right w:type="dxa" w:w="120"/>
-            </w:tcMar>
-          </w:tcPr>
-          <w:p>
-            <w:pPr>
-              <w:spacing w:after="0" w:line="240"/>
-            </w:pPr>
-            <w:r>
-              <w:rPr>
-                <w:sz w:val="19"/>
-                <w:szCs w:val="19"/>
-              </w:rPr>
-              <w:t xml:space="preserve">Permitido</w:t>
-            </w:r>
-          </w:p>
-        </w:tc>
-      </w:tr>
-    </w:tbl>
-    <w:p>
-      <w:pPr>
-        <w:spacing w:after="220" w:line="276"/>
-        <w:jc w:val="center"/>
-      </w:pPr>
-      <w:r>
-        <w:rPr>
-          <w:i/>
-          <w:iCs/>
-          <w:color w:val="5D6675"/>
-          <w:sz w:val="18"/>
-          <w:szCs w:val="18"/>
-        </w:rPr>
-        <w:t xml:space="preserve">Tabla 2. Pruebas ejecutadas contra la base en operación.</w:t>
-      </w:r>
-    </w:p>
-    <w:p>
-      <w:r>
-        <w:br w:type="page"/>
-      </w:r>
-    </w:p>
-    <w:p>
-      <w:pPr>
-        <w:pStyle w:val="Heading1"/>
-        <w:spacing w:after="180" w:before="360"/>
-      </w:pPr>
-      <w:r>
-        <w:t xml:space="preserve">7. Diseño de interfaces y prototipo</w:t>
-      </w:r>
-    </w:p>
-    <w:p>
-      <w:pPr>
-        <w:spacing w:after="120" w:line="276"/>
-      </w:pPr>
-      <w:r>
-        <w:rPr>
-          <w:sz w:val="22"/>
-          <w:szCs w:val="22"/>
-        </w:rPr>
-        <w:t xml:space="preserve">El prototipo es funcional: las capturas que siguen se tomaron de la aplicación en ejecución, conectada a la base de datos real. La aplicación de escritorio está construida con PySide6 y sus once pantallas se diseñan en un editor visual, de modo que la disposición vive en archivos separados del código.</w:t>
-      </w:r>
-    </w:p>
-    <w:p>
-      <w:pPr>
-        <w:pStyle w:val="Heading2"/>
-        <w:spacing w:after="140" w:before="280"/>
-      </w:pPr>
-      <w:r>
-        <w:t xml:space="preserve">7.1 Navegación</w:t>
-      </w:r>
-    </w:p>
-    <w:p>
-      <w:pPr>
-        <w:spacing w:after="120" w:line="276"/>
-      </w:pPr>
-      <w:r>
-        <w:rPr>
-          <w:sz w:val="22"/>
-          <w:szCs w:val="22"/>
-        </w:rPr>
-        <w:t xml:space="preserve">El acceso es una sola puerta y el resto del sistema son cinco pestañas dentro de una misma ventana, más cinco diálogos que se abren sobre ella. No hay menús anidados: una biblioteca escolar atendida por un docente con su propio grupo a cargo no puede permitirse que una operación esté a tres niveles de profundidad.</w:t>
-      </w:r>
-    </w:p>
-    <w:p>
-      <w:pPr>
-        <w:spacing w:after="160" w:line="276"/>
-      </w:pPr>
-      <w:r>
-        <w:rPr>
-          <w:sz w:val="22"/>
-          <w:szCs w:val="22"/>
-        </w:rPr>
-        <w:t xml:space="preserve"/>
-      </w:r>
-    </w:p>
-    <w:tbl>
-      <w:tblPr>
-        <w:tblW w:type="dxa" w:w="9360"/>
-        <w:tblBorders>
-          <w:top w:val="single" w:color="auto" w:sz="4"/>
-          <w:left w:val="single" w:color="auto" w:sz="4"/>
-          <w:bottom w:val="single" w:color="auto" w:sz="4"/>
-          <w:right w:val="single" w:color="auto" w:sz="4"/>
-          <w:insideH w:val="single" w:color="auto" w:sz="4"/>
-          <w:insideV w:val="single" w:color="auto" w:sz="4"/>
-        </w:tblBorders>
-      </w:tblPr>
-      <w:tblGrid>
-        <w:gridCol w:w="2000"/>
-        <w:gridCol w:w="2600"/>
-        <w:gridCol w:w="4760"/>
-      </w:tblGrid>
-      <w:tr>
-        <w:trPr>
-          <w:tblHeader/>
-        </w:trPr>
-        <w:tc>
-          <w:tcPr>
-            <w:tcW w:type="dxa" w:w="2000"/>
-            <w:shd w:fill="E7EBF1" w:val="clear"/>
-            <w:tcMar>
-              <w:top w:type="dxa" w:w="80"/>
-              <w:left w:type="dxa" w:w="120"/>
-              <w:bottom w:type="dxa" w:w="80"/>
-              <w:right w:type="dxa" w:w="120"/>
-            </w:tcMar>
-          </w:tcPr>
-          <w:p>
-            <w:pPr>
-              <w:spacing w:after="0" w:line="240"/>
-            </w:pPr>
-            <w:r>
-              <w:rPr>
-                <w:b/>
-                <w:bCs/>
-                <w:color w:val="2D4B73"/>
-                <w:sz w:val="19"/>
-                <w:szCs w:val="19"/>
-              </w:rPr>
-              <w:t xml:space="preserve">Pantalla</w:t>
-            </w:r>
-          </w:p>
-        </w:tc>
-        <w:tc>
-          <w:tcPr>
-            <w:tcW w:type="dxa" w:w="2600"/>
-            <w:shd w:fill="E7EBF1" w:val="clear"/>
-            <w:tcMar>
-              <w:top w:type="dxa" w:w="80"/>
-              <w:left w:type="dxa" w:w="120"/>
-              <w:bottom w:type="dxa" w:w="80"/>
-              <w:right w:type="dxa" w:w="120"/>
-            </w:tcMar>
-          </w:tcPr>
-          <w:p>
-            <w:pPr>
-              <w:spacing w:after="0" w:line="240"/>
-            </w:pPr>
-            <w:r>
-              <w:rPr>
-                <w:b/>
-                <w:bCs/>
-                <w:color w:val="2D4B73"/>
-                <w:sz w:val="19"/>
-                <w:szCs w:val="19"/>
-              </w:rPr>
-              <w:t xml:space="preserve">Cómo se llega</w:t>
-            </w:r>
-          </w:p>
-        </w:tc>
-        <w:tc>
-          <w:tcPr>
-            <w:tcW w:type="dxa" w:w="4760"/>
-            <w:shd w:fill="E7EBF1" w:val="clear"/>
-            <w:tcMar>
-              <w:top w:type="dxa" w:w="80"/>
-              <w:left w:type="dxa" w:w="120"/>
-              <w:bottom w:type="dxa" w:w="80"/>
-              <w:right w:type="dxa" w:w="120"/>
-            </w:tcMar>
-          </w:tcPr>
-          <w:p>
-            <w:pPr>
-              <w:spacing w:after="0" w:line="240"/>
-            </w:pPr>
-            <w:r>
-              <w:rPr>
-                <w:b/>
-                <w:bCs/>
-                <w:color w:val="2D4B73"/>
-                <w:sz w:val="19"/>
-                <w:szCs w:val="19"/>
-              </w:rPr>
-              <w:t xml:space="preserve">Qué permite</w:t>
-            </w:r>
-          </w:p>
-        </w:tc>
-      </w:tr>
-      <w:tr>
-        <w:tc>
-          <w:tcPr>
-            <w:tcW w:type="dxa" w:w="2000"/>
-            <w:tcMar>
-              <w:top w:type="dxa" w:w="80"/>
-              <w:left w:type="dxa" w:w="120"/>
-              <w:bottom w:type="dxa" w:w="80"/>
-              <w:right w:type="dxa" w:w="120"/>
-            </w:tcMar>
-          </w:tcPr>
-          <w:p>
-            <w:pPr>
-              <w:spacing w:after="0" w:line="240"/>
-            </w:pPr>
-            <w:r>
-              <w:rPr>
-                <w:sz w:val="19"/>
-                <w:szCs w:val="19"/>
-              </w:rPr>
-              <w:t xml:space="preserve">Acceso</w:t>
-            </w:r>
-          </w:p>
-        </w:tc>
-        <w:tc>
-          <w:tcPr>
-            <w:tcW w:type="dxa" w:w="2600"/>
-            <w:tcMar>
-              <w:top w:type="dxa" w:w="80"/>
-              <w:left w:type="dxa" w:w="120"/>
-              <w:bottom w:type="dxa" w:w="80"/>
-              <w:right w:type="dxa" w:w="120"/>
-            </w:tcMar>
-          </w:tcPr>
-          <w:p>
-            <w:pPr>
-              <w:spacing w:after="0" w:line="240"/>
-            </w:pPr>
-            <w:r>
-              <w:rPr>
-                <w:sz w:val="19"/>
-                <w:szCs w:val="19"/>
-              </w:rPr>
-              <w:t xml:space="preserve">Al abrir la aplicación</w:t>
-            </w:r>
-          </w:p>
-        </w:tc>
-        <w:tc>
-          <w:tcPr>
-            <w:tcW w:type="dxa" w:w="4760"/>
-            <w:tcMar>
-              <w:top w:type="dxa" w:w="80"/>
-              <w:left w:type="dxa" w:w="120"/>
-              <w:bottom w:type="dxa" w:w="80"/>
-              <w:right w:type="dxa" w:w="120"/>
-            </w:tcMar>
-          </w:tcPr>
-          <w:p>
-            <w:pPr>
-              <w:spacing w:after="0" w:line="240"/>
-            </w:pPr>
-            <w:r>
-              <w:rPr>
-                <w:sz w:val="19"/>
-                <w:szCs w:val="19"/>
-              </w:rPr>
-              <w:t xml:space="preserve">Iniciar sesión con correo y contraseña</w:t>
-            </w:r>
-          </w:p>
-        </w:tc>
-      </w:tr>
-      <w:tr>
-        <w:tc>
-          <w:tcPr>
-            <w:tcW w:type="dxa" w:w="2000"/>
-            <w:tcMar>
-              <w:top w:type="dxa" w:w="80"/>
-              <w:left w:type="dxa" w:w="120"/>
-              <w:bottom w:type="dxa" w:w="80"/>
-              <w:right w:type="dxa" w:w="120"/>
-            </w:tcMar>
-          </w:tcPr>
-          <w:p>
-            <w:pPr>
-              <w:spacing w:after="0" w:line="240"/>
-            </w:pPr>
-            <w:r>
-              <w:rPr>
-                <w:sz w:val="19"/>
-                <w:szCs w:val="19"/>
-              </w:rPr>
-              <w:t xml:space="preserve">Catálogo</w:t>
-            </w:r>
-          </w:p>
-        </w:tc>
-        <w:tc>
-          <w:tcPr>
-            <w:tcW w:type="dxa" w:w="2600"/>
-            <w:tcMar>
-              <w:top w:type="dxa" w:w="80"/>
-              <w:left w:type="dxa" w:w="120"/>
-              <w:bottom w:type="dxa" w:w="80"/>
-              <w:right w:type="dxa" w:w="120"/>
-            </w:tcMar>
-          </w:tcPr>
-          <w:p>
-            <w:pPr>
-              <w:spacing w:after="0" w:line="240"/>
-            </w:pPr>
-            <w:r>
-              <w:rPr>
-                <w:sz w:val="19"/>
-                <w:szCs w:val="19"/>
-              </w:rPr>
-              <w:t xml:space="preserve">Pestaña</w:t>
-            </w:r>
-          </w:p>
-        </w:tc>
-        <w:tc>
-          <w:tcPr>
-            <w:tcW w:type="dxa" w:w="4760"/>
-            <w:tcMar>
-              <w:top w:type="dxa" w:w="80"/>
-              <w:left w:type="dxa" w:w="120"/>
-              <w:bottom w:type="dxa" w:w="80"/>
-              <w:right w:type="dxa" w:w="120"/>
-            </w:tcMar>
-          </w:tcPr>
-          <w:p>
-            <w:pPr>
-              <w:spacing w:after="0" w:line="240"/>
-            </w:pPr>
-            <w:r>
-              <w:rPr>
-                <w:sz w:val="19"/>
-                <w:szCs w:val="19"/>
-              </w:rPr>
-              <w:t xml:space="preserve">Buscar, dar de alta, modificar y dar de baja libros</w:t>
-            </w:r>
-          </w:p>
-        </w:tc>
-      </w:tr>
-      <w:tr>
-        <w:tc>
-          <w:tcPr>
-            <w:tcW w:type="dxa" w:w="2000"/>
-            <w:tcMar>
-              <w:top w:type="dxa" w:w="80"/>
-              <w:left w:type="dxa" w:w="120"/>
-              <w:bottom w:type="dxa" w:w="80"/>
-              <w:right w:type="dxa" w:w="120"/>
-            </w:tcMar>
-          </w:tcPr>
-          <w:p>
-            <w:pPr>
-              <w:spacing w:after="0" w:line="240"/>
-            </w:pPr>
-            <w:r>
-              <w:rPr>
-                <w:sz w:val="19"/>
-                <w:szCs w:val="19"/>
-              </w:rPr>
-              <w:t xml:space="preserve">Préstamos</w:t>
-            </w:r>
-          </w:p>
-        </w:tc>
-        <w:tc>
-          <w:tcPr>
-            <w:tcW w:type="dxa" w:w="2600"/>
-            <w:tcMar>
-              <w:top w:type="dxa" w:w="80"/>
-              <w:left w:type="dxa" w:w="120"/>
-              <w:bottom w:type="dxa" w:w="80"/>
-              <w:right w:type="dxa" w:w="120"/>
-            </w:tcMar>
-          </w:tcPr>
-          <w:p>
-            <w:pPr>
-              <w:spacing w:after="0" w:line="240"/>
-            </w:pPr>
-            <w:r>
-              <w:rPr>
-                <w:sz w:val="19"/>
-                <w:szCs w:val="19"/>
-              </w:rPr>
-              <w:t xml:space="preserve">Pestaña</w:t>
-            </w:r>
-          </w:p>
-        </w:tc>
-        <w:tc>
-          <w:tcPr>
-            <w:tcW w:type="dxa" w:w="4760"/>
-            <w:tcMar>
-              <w:top w:type="dxa" w:w="80"/>
-              <w:left w:type="dxa" w:w="120"/>
-              <w:bottom w:type="dxa" w:w="80"/>
-              <w:right w:type="dxa" w:w="120"/>
-            </w:tcMar>
-          </w:tcPr>
-          <w:p>
-            <w:pPr>
-              <w:spacing w:after="0" w:line="240"/>
-            </w:pPr>
-            <w:r>
-              <w:rPr>
-                <w:sz w:val="19"/>
-                <w:szCs w:val="19"/>
-              </w:rPr>
-              <w:t xml:space="preserve">Ver los préstamos abiertos, filtrar vencidos, prestar y registrar devoluciones</w:t>
-            </w:r>
-          </w:p>
-        </w:tc>
-      </w:tr>
-      <w:tr>
-        <w:tc>
-          <w:tcPr>
-            <w:tcW w:type="dxa" w:w="2000"/>
-            <w:tcMar>
-              <w:top w:type="dxa" w:w="80"/>
-              <w:left w:type="dxa" w:w="120"/>
-              <w:bottom w:type="dxa" w:w="80"/>
-              <w:right w:type="dxa" w:w="120"/>
-            </w:tcMar>
-          </w:tcPr>
-          <w:p>
-            <w:pPr>
-              <w:spacing w:after="0" w:line="240"/>
-            </w:pPr>
-            <w:r>
-              <w:rPr>
-                <w:sz w:val="19"/>
-                <w:szCs w:val="19"/>
-              </w:rPr>
-              <w:t xml:space="preserve">Alumnos</w:t>
-            </w:r>
-          </w:p>
-        </w:tc>
-        <w:tc>
-          <w:tcPr>
-            <w:tcW w:type="dxa" w:w="2600"/>
-            <w:tcMar>
-              <w:top w:type="dxa" w:w="80"/>
-              <w:left w:type="dxa" w:w="120"/>
-              <w:bottom w:type="dxa" w:w="80"/>
-              <w:right w:type="dxa" w:w="120"/>
-            </w:tcMar>
-          </w:tcPr>
-          <w:p>
-            <w:pPr>
-              <w:spacing w:after="0" w:line="240"/>
-            </w:pPr>
-            <w:r>
-              <w:rPr>
-                <w:sz w:val="19"/>
-                <w:szCs w:val="19"/>
-              </w:rPr>
-              <w:t xml:space="preserve">Pestaña</w:t>
-            </w:r>
-          </w:p>
-        </w:tc>
-        <w:tc>
-          <w:tcPr>
-            <w:tcW w:type="dxa" w:w="4760"/>
-            <w:tcMar>
-              <w:top w:type="dxa" w:w="80"/>
-              <w:left w:type="dxa" w:w="120"/>
-              <w:bottom w:type="dxa" w:w="80"/>
-              <w:right w:type="dxa" w:w="120"/>
-            </w:tcMar>
-          </w:tcPr>
-          <w:p>
-            <w:pPr>
-              <w:spacing w:after="0" w:line="240"/>
-            </w:pPr>
-            <w:r>
-              <w:rPr>
-                <w:sz w:val="19"/>
-                <w:szCs w:val="19"/>
-              </w:rPr>
-              <w:t xml:space="preserve">Padrón, alta, modificación e historial de cada alumno</w:t>
-            </w:r>
-          </w:p>
-        </w:tc>
-      </w:tr>
-      <w:tr>
-        <w:tc>
-          <w:tcPr>
-            <w:tcW w:type="dxa" w:w="2000"/>
-            <w:tcMar>
-              <w:top w:type="dxa" w:w="80"/>
-              <w:left w:type="dxa" w:w="120"/>
-              <w:bottom w:type="dxa" w:w="80"/>
-              <w:right w:type="dxa" w:w="120"/>
-            </w:tcMar>
-          </w:tcPr>
-          <w:p>
-            <w:pPr>
-              <w:spacing w:after="0" w:line="240"/>
-            </w:pPr>
-            <w:r>
-              <w:rPr>
-                <w:sz w:val="19"/>
-                <w:szCs w:val="19"/>
-              </w:rPr>
-              <w:t xml:space="preserve">Deudores</w:t>
-            </w:r>
-          </w:p>
-        </w:tc>
-        <w:tc>
-          <w:tcPr>
-            <w:tcW w:type="dxa" w:w="2600"/>
-            <w:tcMar>
-              <w:top w:type="dxa" w:w="80"/>
-              <w:left w:type="dxa" w:w="120"/>
-              <w:bottom w:type="dxa" w:w="80"/>
-              <w:right w:type="dxa" w:w="120"/>
-            </w:tcMar>
-          </w:tcPr>
-          <w:p>
-            <w:pPr>
-              <w:spacing w:after="0" w:line="240"/>
-            </w:pPr>
-            <w:r>
-              <w:rPr>
-                <w:sz w:val="19"/>
-                <w:szCs w:val="19"/>
-              </w:rPr>
-              <w:t xml:space="preserve">Pestaña</w:t>
-            </w:r>
-          </w:p>
-        </w:tc>
-        <w:tc>
-          <w:tcPr>
-            <w:tcW w:type="dxa" w:w="4760"/>
-            <w:tcMar>
-              <w:top w:type="dxa" w:w="80"/>
-              <w:left w:type="dxa" w:w="120"/>
-              <w:bottom w:type="dxa" w:w="80"/>
-              <w:right w:type="dxa" w:w="120"/>
-            </w:tcMar>
-          </w:tcPr>
-          <w:p>
-            <w:pPr>
-              <w:spacing w:after="0" w:line="240"/>
-            </w:pPr>
-            <w:r>
-              <w:rPr>
-                <w:sz w:val="19"/>
-                <w:szCs w:val="19"/>
-              </w:rPr>
-              <w:t xml:space="preserve">Reporte de quién debe, desde cuándo y cómo localizar al tutor</w:t>
-            </w:r>
-          </w:p>
-        </w:tc>
-      </w:tr>
-      <w:tr>
-        <w:tc>
-          <w:tcPr>
-            <w:tcW w:type="dxa" w:w="2000"/>
-            <w:tcMar>
-              <w:top w:type="dxa" w:w="80"/>
-              <w:left w:type="dxa" w:w="120"/>
-              <w:bottom w:type="dxa" w:w="80"/>
-              <w:right w:type="dxa" w:w="120"/>
-            </w:tcMar>
-          </w:tcPr>
-          <w:p>
-            <w:pPr>
-              <w:spacing w:after="0" w:line="240"/>
-            </w:pPr>
-            <w:r>
-              <w:rPr>
-                <w:sz w:val="19"/>
-                <w:szCs w:val="19"/>
-              </w:rPr>
-              <w:t xml:space="preserve">Empleados</w:t>
-            </w:r>
-          </w:p>
-        </w:tc>
-        <w:tc>
-          <w:tcPr>
-            <w:tcW w:type="dxa" w:w="2600"/>
-            <w:tcMar>
-              <w:top w:type="dxa" w:w="80"/>
-              <w:left w:type="dxa" w:w="120"/>
-              <w:bottom w:type="dxa" w:w="80"/>
-              <w:right w:type="dxa" w:w="120"/>
-            </w:tcMar>
-          </w:tcPr>
-          <w:p>
-            <w:pPr>
-              <w:spacing w:after="0" w:line="240"/>
-            </w:pPr>
-            <w:r>
-              <w:rPr>
-                <w:sz w:val="19"/>
-                <w:szCs w:val="19"/>
-              </w:rPr>
-              <w:t xml:space="preserve">Pestaña</w:t>
-            </w:r>
-          </w:p>
-        </w:tc>
-        <w:tc>
-          <w:tcPr>
-            <w:tcW w:type="dxa" w:w="4760"/>
-            <w:tcMar>
-              <w:top w:type="dxa" w:w="80"/>
-              <w:left w:type="dxa" w:w="120"/>
-              <w:bottom w:type="dxa" w:w="80"/>
-              <w:right w:type="dxa" w:w="120"/>
-            </w:tcMar>
-          </w:tcPr>
-          <w:p>
-            <w:pPr>
-              <w:spacing w:after="0" w:line="240"/>
-            </w:pPr>
-            <w:r>
-              <w:rPr>
-                <w:sz w:val="19"/>
-                <w:szCs w:val="19"/>
-              </w:rPr>
-              <w:t xml:space="preserve">Plantilla del personal y alta de empleados</w:t>
-            </w:r>
-          </w:p>
-        </w:tc>
-      </w:tr>
-      <w:tr>
-        <w:tc>
-          <w:tcPr>
-            <w:tcW w:type="dxa" w:w="2000"/>
-            <w:tcMar>
-              <w:top w:type="dxa" w:w="80"/>
-              <w:left w:type="dxa" w:w="120"/>
-              <w:bottom w:type="dxa" w:w="80"/>
-              <w:right w:type="dxa" w:w="120"/>
-            </w:tcMar>
-          </w:tcPr>
-          <w:p>
-            <w:pPr>
-              <w:spacing w:after="0" w:line="240"/>
-            </w:pPr>
-            <w:r>
-              <w:rPr>
-                <w:sz w:val="19"/>
-                <w:szCs w:val="19"/>
-              </w:rPr>
-              <w:t xml:space="preserve">Nuevo préstamo</w:t>
-            </w:r>
-          </w:p>
-        </w:tc>
-        <w:tc>
-          <w:tcPr>
-            <w:tcW w:type="dxa" w:w="2600"/>
-            <w:tcMar>
-              <w:top w:type="dxa" w:w="80"/>
-              <w:left w:type="dxa" w:w="120"/>
-              <w:bottom w:type="dxa" w:w="80"/>
-              <w:right w:type="dxa" w:w="120"/>
-            </w:tcMar>
-          </w:tcPr>
-          <w:p>
-            <w:pPr>
-              <w:spacing w:after="0" w:line="240"/>
-            </w:pPr>
-            <w:r>
-              <w:rPr>
-                <w:sz w:val="19"/>
-                <w:szCs w:val="19"/>
-              </w:rPr>
-              <w:t xml:space="preserve">Diálogo desde Préstamos</w:t>
-            </w:r>
-          </w:p>
-        </w:tc>
-        <w:tc>
-          <w:tcPr>
-            <w:tcW w:type="dxa" w:w="4760"/>
-            <w:tcMar>
-              <w:top w:type="dxa" w:w="80"/>
-              <w:left w:type="dxa" w:w="120"/>
-              <w:bottom w:type="dxa" w:w="80"/>
-              <w:right w:type="dxa" w:w="120"/>
-            </w:tcMar>
-          </w:tcPr>
-          <w:p>
-            <w:pPr>
-              <w:spacing w:after="0" w:line="240"/>
-            </w:pPr>
-            <w:r>
-              <w:rPr>
-                <w:sz w:val="19"/>
-                <w:szCs w:val="19"/>
-              </w:rPr>
-              <w:t xml:space="preserve">Dos búsquedas y un botón</w:t>
-            </w:r>
-          </w:p>
-        </w:tc>
-      </w:tr>
-      <w:tr>
-        <w:tc>
-          <w:tcPr>
-            <w:tcW w:type="dxa" w:w="2000"/>
-            <w:tcMar>
-              <w:top w:type="dxa" w:w="80"/>
-              <w:left w:type="dxa" w:w="120"/>
-              <w:bottom w:type="dxa" w:w="80"/>
-              <w:right w:type="dxa" w:w="120"/>
-            </w:tcMar>
-          </w:tcPr>
-          <w:p>
-            <w:pPr>
-              <w:spacing w:after="0" w:line="240"/>
-            </w:pPr>
-            <w:r>
-              <w:rPr>
-                <w:sz w:val="19"/>
-                <w:szCs w:val="19"/>
-              </w:rPr>
-              <w:t xml:space="preserve">Formulario de libro</w:t>
-            </w:r>
-          </w:p>
-        </w:tc>
-        <w:tc>
-          <w:tcPr>
-            <w:tcW w:type="dxa" w:w="2600"/>
-            <w:tcMar>
-              <w:top w:type="dxa" w:w="80"/>
-              <w:left w:type="dxa" w:w="120"/>
-              <w:bottom w:type="dxa" w:w="80"/>
-              <w:right w:type="dxa" w:w="120"/>
-            </w:tcMar>
-          </w:tcPr>
-          <w:p>
-            <w:pPr>
-              <w:spacing w:after="0" w:line="240"/>
-            </w:pPr>
-            <w:r>
-              <w:rPr>
-                <w:sz w:val="19"/>
-                <w:szCs w:val="19"/>
-              </w:rPr>
-              <w:t xml:space="preserve">Diálogo desde Catálogo</w:t>
-            </w:r>
-          </w:p>
-        </w:tc>
-        <w:tc>
-          <w:tcPr>
-            <w:tcW w:type="dxa" w:w="4760"/>
-            <w:tcMar>
-              <w:top w:type="dxa" w:w="80"/>
-              <w:left w:type="dxa" w:w="120"/>
-              <w:bottom w:type="dxa" w:w="80"/>
-              <w:right w:type="dxa" w:w="120"/>
-            </w:tcMar>
-          </w:tcPr>
-          <w:p>
-            <w:pPr>
-              <w:spacing w:after="0" w:line="240"/>
-            </w:pPr>
-            <w:r>
-              <w:rPr>
-                <w:sz w:val="19"/>
-                <w:szCs w:val="19"/>
-              </w:rPr>
-              <w:t xml:space="preserve">Alta y modificación</w:t>
-            </w:r>
-          </w:p>
-        </w:tc>
-      </w:tr>
-      <w:tr>
-        <w:tc>
-          <w:tcPr>
-            <w:tcW w:type="dxa" w:w="2000"/>
-            <w:tcMar>
-              <w:top w:type="dxa" w:w="80"/>
-              <w:left w:type="dxa" w:w="120"/>
-              <w:bottom w:type="dxa" w:w="80"/>
-              <w:right w:type="dxa" w:w="120"/>
-            </w:tcMar>
-          </w:tcPr>
-          <w:p>
-            <w:pPr>
-              <w:spacing w:after="0" w:line="240"/>
-            </w:pPr>
-            <w:r>
-              <w:rPr>
-                <w:sz w:val="19"/>
-                <w:szCs w:val="19"/>
-              </w:rPr>
-              <w:t xml:space="preserve">Formulario de alumno</w:t>
-            </w:r>
-          </w:p>
-        </w:tc>
-        <w:tc>
-          <w:tcPr>
-            <w:tcW w:type="dxa" w:w="2600"/>
-            <w:tcMar>
-              <w:top w:type="dxa" w:w="80"/>
-              <w:left w:type="dxa" w:w="120"/>
-              <w:bottom w:type="dxa" w:w="80"/>
-              <w:right w:type="dxa" w:w="120"/>
-            </w:tcMar>
-          </w:tcPr>
-          <w:p>
-            <w:pPr>
-              <w:spacing w:after="0" w:line="240"/>
-            </w:pPr>
-            <w:r>
-              <w:rPr>
-                <w:sz w:val="19"/>
-                <w:szCs w:val="19"/>
-              </w:rPr>
-              <w:t xml:space="preserve">Diálogo desde Alumnos</w:t>
-            </w:r>
-          </w:p>
-        </w:tc>
-        <w:tc>
-          <w:tcPr>
-            <w:tcW w:type="dxa" w:w="4760"/>
-            <w:tcMar>
-              <w:top w:type="dxa" w:w="80"/>
-              <w:left w:type="dxa" w:w="120"/>
-              <w:bottom w:type="dxa" w:w="80"/>
-              <w:right w:type="dxa" w:w="120"/>
-            </w:tcMar>
-          </w:tcPr>
-          <w:p>
-            <w:pPr>
-              <w:spacing w:after="0" w:line="240"/>
-            </w:pPr>
-            <w:r>
-              <w:rPr>
-                <w:sz w:val="19"/>
-                <w:szCs w:val="19"/>
-              </w:rPr>
-              <w:t xml:space="preserve">Alta y modificación</w:t>
-            </w:r>
-          </w:p>
-        </w:tc>
-      </w:tr>
-      <w:tr>
-        <w:tc>
-          <w:tcPr>
-            <w:tcW w:type="dxa" w:w="2000"/>
-            <w:tcMar>
-              <w:top w:type="dxa" w:w="80"/>
-              <w:left w:type="dxa" w:w="120"/>
-              <w:bottom w:type="dxa" w:w="80"/>
-              <w:right w:type="dxa" w:w="120"/>
-            </w:tcMar>
-          </w:tcPr>
-          <w:p>
-            <w:pPr>
-              <w:spacing w:after="0" w:line="240"/>
-            </w:pPr>
-            <w:r>
-              <w:rPr>
-                <w:sz w:val="19"/>
-                <w:szCs w:val="19"/>
-              </w:rPr>
-              <w:t xml:space="preserve">Historial del alumno</w:t>
-            </w:r>
-          </w:p>
-        </w:tc>
-        <w:tc>
-          <w:tcPr>
-            <w:tcW w:type="dxa" w:w="2600"/>
-            <w:tcMar>
-              <w:top w:type="dxa" w:w="80"/>
-              <w:left w:type="dxa" w:w="120"/>
-              <w:bottom w:type="dxa" w:w="80"/>
-              <w:right w:type="dxa" w:w="120"/>
-            </w:tcMar>
-          </w:tcPr>
-          <w:p>
-            <w:pPr>
-              <w:spacing w:after="0" w:line="240"/>
-            </w:pPr>
-            <w:r>
-              <w:rPr>
-                <w:sz w:val="19"/>
-                <w:szCs w:val="19"/>
-              </w:rPr>
-              <w:t xml:space="preserve">Diálogo desde Alumnos</w:t>
-            </w:r>
-          </w:p>
-        </w:tc>
-        <w:tc>
-          <w:tcPr>
-            <w:tcW w:type="dxa" w:w="4760"/>
-            <w:tcMar>
-              <w:top w:type="dxa" w:w="80"/>
-              <w:left w:type="dxa" w:w="120"/>
-              <w:bottom w:type="dxa" w:w="80"/>
-              <w:right w:type="dxa" w:w="120"/>
-            </w:tcMar>
-          </w:tcPr>
-          <w:p>
-            <w:pPr>
-              <w:spacing w:after="0" w:line="240"/>
-            </w:pPr>
-            <w:r>
-              <w:rPr>
-                <w:sz w:val="19"/>
-                <w:szCs w:val="19"/>
-              </w:rPr>
-              <w:t xml:space="preserve">Todos sus préstamos, incluidos los concluidos</w:t>
-            </w:r>
-          </w:p>
-        </w:tc>
-      </w:tr>
-      <w:tr>
-        <w:tc>
-          <w:tcPr>
-            <w:tcW w:type="dxa" w:w="2000"/>
-            <w:tcMar>
-              <w:top w:type="dxa" w:w="80"/>
-              <w:left w:type="dxa" w:w="120"/>
-              <w:bottom w:type="dxa" w:w="80"/>
-              <w:right w:type="dxa" w:w="120"/>
-            </w:tcMar>
-          </w:tcPr>
-          <w:p>
-            <w:pPr>
-              <w:spacing w:after="0" w:line="240"/>
-            </w:pPr>
-            <w:r>
-              <w:rPr>
-                <w:sz w:val="19"/>
-                <w:szCs w:val="19"/>
-              </w:rPr>
-              <w:t xml:space="preserve">Formulario de empleado</w:t>
-            </w:r>
-          </w:p>
-        </w:tc>
-        <w:tc>
-          <w:tcPr>
-            <w:tcW w:type="dxa" w:w="2600"/>
-            <w:tcMar>
-              <w:top w:type="dxa" w:w="80"/>
-              <w:left w:type="dxa" w:w="120"/>
-              <w:bottom w:type="dxa" w:w="80"/>
-              <w:right w:type="dxa" w:w="120"/>
-            </w:tcMar>
-          </w:tcPr>
-          <w:p>
-            <w:pPr>
-              <w:spacing w:after="0" w:line="240"/>
-            </w:pPr>
-            <w:r>
-              <w:rPr>
-                <w:sz w:val="19"/>
-                <w:szCs w:val="19"/>
-              </w:rPr>
-              <w:t xml:space="preserve">Diálogo desde Empleados</w:t>
-            </w:r>
-          </w:p>
-        </w:tc>
-        <w:tc>
-          <w:tcPr>
-            <w:tcW w:type="dxa" w:w="4760"/>
-            <w:tcMar>
-              <w:top w:type="dxa" w:w="80"/>
-              <w:left w:type="dxa" w:w="120"/>
-              <w:bottom w:type="dxa" w:w="80"/>
-              <w:right w:type="dxa" w:w="120"/>
-            </w:tcMar>
-          </w:tcPr>
-          <w:p>
-            <w:pPr>
-              <w:spacing w:after="0" w:line="240"/>
-            </w:pPr>
-            <w:r>
-              <w:rPr>
-                <w:sz w:val="19"/>
-                <w:szCs w:val="19"/>
-              </w:rPr>
-              <w:t xml:space="preserve">Alta y modificación del personal</w:t>
-            </w:r>
-          </w:p>
-        </w:tc>
-      </w:tr>
-    </w:tbl>
-    <w:p>
-      <w:pPr>
-        <w:pStyle w:val="Heading2"/>
-        <w:spacing w:after="140" w:before="280"/>
-      </w:pPr>
-      <w:r>
-        <w:t xml:space="preserve">7.2 Acceso</w:t>
+        <w:t xml:space="preserve">Captura del esquema tal como lo muestra el panel de administración de la base de datos, con las siete tablas, sus columnas con tipo, y las relaciones entre ellas. La columna auth_id de perfiles enlaza con el sistema de autenticación, que es un esquema aparte.</w:t>
       </w:r>
     </w:p>
     <w:p>
@@ -9292,7 +7653,7 @@
       <w:r>
         <w:drawing>
           <wp:inline distT="0" distB="0" distL="0" distR="0">
-            <wp:extent cx="3619500" cy="2495550"/>
+            <wp:extent cx="5334000" cy="5248275"/>
             <wp:effectExtent t="0" r="0" b="0" l="0"/>
             <wp:docPr id="1" name="" descr="" title=""/>
             <wp:cNvGraphicFramePr>
@@ -9317,7 +7678,7 @@
                   <pic:spPr bwMode="auto">
                     <a:xfrm>
                       <a:off x="0" y="0"/>
-                      <a:ext cx="3619500" cy="2495550"/>
+                      <a:ext cx="5334000" cy="5248275"/>
                     </a:xfrm>
                     <a:prstGeom prst="rect">
                       <a:avLst/>
@@ -9343,7 +7704,19 @@
           <w:sz w:val="18"/>
           <w:szCs w:val="18"/>
         </w:rPr>
-        <w:t xml:space="preserve">Figura 5. Pantalla de acceso. El mensaje de error es el mismo para un correo inexistente y para una contraseña incorrecta, para no revelar cuál de los dos falló.</w:t>
+        <w:t xml:space="preserve">Figura 5. Esquema en operación, capturado del panel del gestor.</w:t>
+      </w:r>
+    </w:p>
+    <w:p>
+      <w:pPr>
+        <w:spacing w:after="120" w:line="276"/>
+      </w:pPr>
+      <w:r>
+        <w:rPr>
+          <w:sz w:val="22"/>
+          <w:szCs w:val="22"/>
+        </w:rPr>
+        <w:t xml:space="preserve">La tabla notificaciones aparece en el esquema y no en el modelo del capítulo 5, porque su estructura está creada y la funcionalidad de avisos corresponde a la siguiente iteración.</w:t>
       </w:r>
     </w:p>
     <w:p>
@@ -9352,7 +7725,1821 @@
         <w:spacing w:after="140" w:before="280"/>
       </w:pPr>
       <w:r>
-        <w:t xml:space="preserve">7.3 Catálogo</w:t>
+        <w:t xml:space="preserve">6.3 Integridad referencial</w:t>
+      </w:r>
+    </w:p>
+    <w:p>
+      <w:pPr>
+        <w:spacing w:after="120" w:line="276"/>
+      </w:pPr>
+      <w:r>
+        <w:rPr>
+          <w:sz w:val="22"/>
+          <w:szCs w:val="22"/>
+        </w:rPr>
+        <w:t xml:space="preserve">Las claves foráneas de los préstamos usan restricción, no borrado en cascada. Es deliberado: borrar un alumno o un libro en cascada se llevaría su historial de préstamos, que es justo lo que el requisito de conservación permanente prohíbe. El sistema anterior lo hacía en cascada y por eso perdía el historial.</w:t>
+      </w:r>
+    </w:p>
+    <w:p>
+      <w:pPr>
+        <w:spacing w:after="120" w:line="276"/>
+      </w:pPr>
+      <w:r>
+        <w:rPr>
+          <w:sz w:val="22"/>
+          <w:szCs w:val="22"/>
+        </w:rPr>
+        <w:t xml:space="preserve">Las restricciones de comprobación cubren lo que el dominio no admite: existencias no negativas, páginas positivas, grado entre uno y seis, año de publicación no futuro, y coherencia entre el estado de un préstamo y su fecha de devolución.</w:t>
+      </w:r>
+    </w:p>
+    <w:p>
+      <w:pPr>
+        <w:pStyle w:val="Heading2"/>
+        <w:spacing w:after="140" w:before="280"/>
+      </w:pPr>
+      <w:r>
+        <w:t xml:space="preserve">6.4 Control de acceso</w:t>
+      </w:r>
+    </w:p>
+    <w:p>
+      <w:pPr>
+        <w:spacing w:after="120" w:line="276"/>
+      </w:pPr>
+      <w:r>
+        <w:rPr>
+          <w:sz w:val="22"/>
+          <w:szCs w:val="22"/>
+        </w:rPr>
+        <w:t xml:space="preserve">Las siete tablas tienen activada la seguridad a nivel de fila, con dieciséis políticas. El personal de la biblioteca alcanza los registros que necesita para operar; un alumno autenticado solo alcanza su propio perfil y sus propios préstamos. Se verificó con una cuenta real de cada perfil.</w:t>
+      </w:r>
+    </w:p>
+    <w:p>
+      <w:pPr>
+        <w:spacing w:after="120" w:line="276"/>
+      </w:pPr>
+      <w:r>
+        <w:rPr>
+          <w:sz w:val="22"/>
+          <w:szCs w:val="22"/>
+        </w:rPr>
+        <w:t xml:space="preserve">El control vive en la base y no en la interfaz, por una razón concreta: la llave de acceso que viaja dentro de la aplicación es pública por diseño, así que cualquier regla que viviera solo en el cliente podría saltarse llamando la interfaz de programación directamente.</w:t>
+      </w:r>
+    </w:p>
+    <w:p>
+      <w:pPr>
+        <w:pStyle w:val="Heading2"/>
+        <w:spacing w:after="140" w:before="280"/>
+      </w:pPr>
+      <w:r>
+        <w:t xml:space="preserve">6.5 Evidencia de funcionamiento y datos de prueba</w:t>
+      </w:r>
+    </w:p>
+    <w:p>
+      <w:pPr>
+        <w:spacing w:after="120" w:line="276"/>
+      </w:pPr>
+      <w:r>
+        <w:rPr>
+          <w:sz w:val="22"/>
+          <w:szCs w:val="22"/>
+        </w:rPr>
+        <w:t xml:space="preserve">La base contiene un juego de datos apropiado para una biblioteca escolar: once libros, seis alumnos, dos empleados y siete préstamos, de los cuales cuatro están vencidos a propósito para que el reporte de deudores tenga qué mostrar.</w:t>
+      </w:r>
+    </w:p>
+    <w:p>
+      <w:pPr>
+        <w:spacing w:after="120" w:line="276"/>
+      </w:pPr>
+      <w:r>
+        <w:rPr>
+          <w:sz w:val="22"/>
+          <w:szCs w:val="22"/>
+        </w:rPr>
+        <w:t xml:space="preserve">El funcionamiento se comprobó ejecutando las reglas contra la base real, dentro de transacciones que se revierten para no alterar los datos:</w:t>
+      </w:r>
+    </w:p>
+    <w:p>
+      <w:pPr>
+        <w:spacing w:after="160" w:line="276"/>
+      </w:pPr>
+      <w:r>
+        <w:rPr>
+          <w:sz w:val="22"/>
+          <w:szCs w:val="22"/>
+        </w:rPr>
+        <w:t xml:space="preserve"/>
+      </w:r>
+    </w:p>
+    <w:tbl>
+      <w:tblPr>
+        <w:tblW w:type="dxa" w:w="9360"/>
+        <w:tblBorders>
+          <w:top w:val="single" w:color="auto" w:sz="4"/>
+          <w:left w:val="single" w:color="auto" w:sz="4"/>
+          <w:bottom w:val="single" w:color="auto" w:sz="4"/>
+          <w:right w:val="single" w:color="auto" w:sz="4"/>
+          <w:insideH w:val="single" w:color="auto" w:sz="4"/>
+          <w:insideV w:val="single" w:color="auto" w:sz="4"/>
+        </w:tblBorders>
+      </w:tblPr>
+      <w:tblGrid>
+        <w:gridCol w:w="3100"/>
+        <w:gridCol w:w="2900"/>
+        <w:gridCol w:w="3360"/>
+      </w:tblGrid>
+      <w:tr>
+        <w:trPr>
+          <w:tblHeader/>
+        </w:trPr>
+        <w:tc>
+          <w:tcPr>
+            <w:tcW w:type="dxa" w:w="3100"/>
+            <w:shd w:fill="E7EBF1" w:val="clear"/>
+            <w:tcMar>
+              <w:top w:type="dxa" w:w="80"/>
+              <w:left w:type="dxa" w:w="120"/>
+              <w:bottom w:type="dxa" w:w="80"/>
+              <w:right w:type="dxa" w:w="120"/>
+            </w:tcMar>
+          </w:tcPr>
+          <w:p>
+            <w:pPr>
+              <w:spacing w:after="0" w:line="240"/>
+            </w:pPr>
+            <w:r>
+              <w:rPr>
+                <w:b/>
+                <w:bCs/>
+                <w:color w:val="2D4B73"/>
+                <w:sz w:val="19"/>
+                <w:szCs w:val="19"/>
+              </w:rPr>
+              <w:t xml:space="preserve">Comprobación</w:t>
+            </w:r>
+          </w:p>
+        </w:tc>
+        <w:tc>
+          <w:tcPr>
+            <w:tcW w:type="dxa" w:w="2900"/>
+            <w:shd w:fill="E7EBF1" w:val="clear"/>
+            <w:tcMar>
+              <w:top w:type="dxa" w:w="80"/>
+              <w:left w:type="dxa" w:w="120"/>
+              <w:bottom w:type="dxa" w:w="80"/>
+              <w:right w:type="dxa" w:w="120"/>
+            </w:tcMar>
+          </w:tcPr>
+          <w:p>
+            <w:pPr>
+              <w:spacing w:after="0" w:line="240"/>
+            </w:pPr>
+            <w:r>
+              <w:rPr>
+                <w:b/>
+                <w:bCs/>
+                <w:color w:val="2D4B73"/>
+                <w:sz w:val="19"/>
+                <w:szCs w:val="19"/>
+              </w:rPr>
+              <w:t xml:space="preserve">Resultado esperado</w:t>
+            </w:r>
+          </w:p>
+        </w:tc>
+        <w:tc>
+          <w:tcPr>
+            <w:tcW w:type="dxa" w:w="3360"/>
+            <w:shd w:fill="E7EBF1" w:val="clear"/>
+            <w:tcMar>
+              <w:top w:type="dxa" w:w="80"/>
+              <w:left w:type="dxa" w:w="120"/>
+              <w:bottom w:type="dxa" w:w="80"/>
+              <w:right w:type="dxa" w:w="120"/>
+            </w:tcMar>
+          </w:tcPr>
+          <w:p>
+            <w:pPr>
+              <w:spacing w:after="0" w:line="240"/>
+            </w:pPr>
+            <w:r>
+              <w:rPr>
+                <w:b/>
+                <w:bCs/>
+                <w:color w:val="2D4B73"/>
+                <w:sz w:val="19"/>
+                <w:szCs w:val="19"/>
+              </w:rPr>
+              <w:t xml:space="preserve">Resultado obtenido</w:t>
+            </w:r>
+          </w:p>
+        </w:tc>
+      </w:tr>
+      <w:tr>
+        <w:tc>
+          <w:tcPr>
+            <w:tcW w:type="dxa" w:w="3100"/>
+            <w:tcMar>
+              <w:top w:type="dxa" w:w="80"/>
+              <w:left w:type="dxa" w:w="120"/>
+              <w:bottom w:type="dxa" w:w="80"/>
+              <w:right w:type="dxa" w:w="120"/>
+            </w:tcMar>
+          </w:tcPr>
+          <w:p>
+            <w:pPr>
+              <w:spacing w:after="0" w:line="240"/>
+            </w:pPr>
+            <w:r>
+              <w:rPr>
+                <w:sz w:val="19"/>
+                <w:szCs w:val="19"/>
+              </w:rPr>
+              <w:t xml:space="preserve">Registrar un préstamo</w:t>
+            </w:r>
+          </w:p>
+        </w:tc>
+        <w:tc>
+          <w:tcPr>
+            <w:tcW w:type="dxa" w:w="2900"/>
+            <w:tcMar>
+              <w:top w:type="dxa" w:w="80"/>
+              <w:left w:type="dxa" w:w="120"/>
+              <w:bottom w:type="dxa" w:w="80"/>
+              <w:right w:type="dxa" w:w="120"/>
+            </w:tcMar>
+          </w:tcPr>
+          <w:p>
+            <w:pPr>
+              <w:spacing w:after="0" w:line="240"/>
+            </w:pPr>
+            <w:r>
+              <w:rPr>
+                <w:sz w:val="19"/>
+                <w:szCs w:val="19"/>
+              </w:rPr>
+              <w:t xml:space="preserve">Una unidad menos en existencias</w:t>
+            </w:r>
+          </w:p>
+        </w:tc>
+        <w:tc>
+          <w:tcPr>
+            <w:tcW w:type="dxa" w:w="3360"/>
+            <w:tcMar>
+              <w:top w:type="dxa" w:w="80"/>
+              <w:left w:type="dxa" w:w="120"/>
+              <w:bottom w:type="dxa" w:w="80"/>
+              <w:right w:type="dxa" w:w="120"/>
+            </w:tcMar>
+          </w:tcPr>
+          <w:p>
+            <w:pPr>
+              <w:spacing w:after="0" w:line="240"/>
+            </w:pPr>
+            <w:r>
+              <w:rPr>
+                <w:sz w:val="19"/>
+                <w:szCs w:val="19"/>
+              </w:rPr>
+              <w:t xml:space="preserve">3 → 2</w:t>
+            </w:r>
+          </w:p>
+        </w:tc>
+      </w:tr>
+      <w:tr>
+        <w:tc>
+          <w:tcPr>
+            <w:tcW w:type="dxa" w:w="3100"/>
+            <w:tcMar>
+              <w:top w:type="dxa" w:w="80"/>
+              <w:left w:type="dxa" w:w="120"/>
+              <w:bottom w:type="dxa" w:w="80"/>
+              <w:right w:type="dxa" w:w="120"/>
+            </w:tcMar>
+          </w:tcPr>
+          <w:p>
+            <w:pPr>
+              <w:spacing w:after="0" w:line="240"/>
+            </w:pPr>
+            <w:r>
+              <w:rPr>
+                <w:sz w:val="19"/>
+                <w:szCs w:val="19"/>
+              </w:rPr>
+              <w:t xml:space="preserve">Registrar la devolución</w:t>
+            </w:r>
+          </w:p>
+        </w:tc>
+        <w:tc>
+          <w:tcPr>
+            <w:tcW w:type="dxa" w:w="2900"/>
+            <w:tcMar>
+              <w:top w:type="dxa" w:w="80"/>
+              <w:left w:type="dxa" w:w="120"/>
+              <w:bottom w:type="dxa" w:w="80"/>
+              <w:right w:type="dxa" w:w="120"/>
+            </w:tcMar>
+          </w:tcPr>
+          <w:p>
+            <w:pPr>
+              <w:spacing w:after="0" w:line="240"/>
+            </w:pPr>
+            <w:r>
+              <w:rPr>
+                <w:sz w:val="19"/>
+                <w:szCs w:val="19"/>
+              </w:rPr>
+              <w:t xml:space="preserve">La unidad vuelve al inventario</w:t>
+            </w:r>
+          </w:p>
+        </w:tc>
+        <w:tc>
+          <w:tcPr>
+            <w:tcW w:type="dxa" w:w="3360"/>
+            <w:tcMar>
+              <w:top w:type="dxa" w:w="80"/>
+              <w:left w:type="dxa" w:w="120"/>
+              <w:bottom w:type="dxa" w:w="80"/>
+              <w:right w:type="dxa" w:w="120"/>
+            </w:tcMar>
+          </w:tcPr>
+          <w:p>
+            <w:pPr>
+              <w:spacing w:after="0" w:line="240"/>
+            </w:pPr>
+            <w:r>
+              <w:rPr>
+                <w:sz w:val="19"/>
+                <w:szCs w:val="19"/>
+              </w:rPr>
+              <w:t xml:space="preserve">2 → 3</w:t>
+            </w:r>
+          </w:p>
+        </w:tc>
+      </w:tr>
+      <w:tr>
+        <w:tc>
+          <w:tcPr>
+            <w:tcW w:type="dxa" w:w="3100"/>
+            <w:tcMar>
+              <w:top w:type="dxa" w:w="80"/>
+              <w:left w:type="dxa" w:w="120"/>
+              <w:bottom w:type="dxa" w:w="80"/>
+              <w:right w:type="dxa" w:w="120"/>
+            </w:tcMar>
+          </w:tcPr>
+          <w:p>
+            <w:pPr>
+              <w:spacing w:after="0" w:line="240"/>
+            </w:pPr>
+            <w:r>
+              <w:rPr>
+                <w:sz w:val="19"/>
+                <w:szCs w:val="19"/>
+              </w:rPr>
+              <w:t xml:space="preserve">Reabrir el préstamo devuelto</w:t>
+            </w:r>
+          </w:p>
+        </w:tc>
+        <w:tc>
+          <w:tcPr>
+            <w:tcW w:type="dxa" w:w="2900"/>
+            <w:tcMar>
+              <w:top w:type="dxa" w:w="80"/>
+              <w:left w:type="dxa" w:w="120"/>
+              <w:bottom w:type="dxa" w:w="80"/>
+              <w:right w:type="dxa" w:w="120"/>
+            </w:tcMar>
+          </w:tcPr>
+          <w:p>
+            <w:pPr>
+              <w:spacing w:after="0" w:line="240"/>
+            </w:pPr>
+            <w:r>
+              <w:rPr>
+                <w:sz w:val="19"/>
+                <w:szCs w:val="19"/>
+              </w:rPr>
+              <w:t xml:space="preserve">Vuelve a salir del inventario</w:t>
+            </w:r>
+          </w:p>
+        </w:tc>
+        <w:tc>
+          <w:tcPr>
+            <w:tcW w:type="dxa" w:w="3360"/>
+            <w:tcMar>
+              <w:top w:type="dxa" w:w="80"/>
+              <w:left w:type="dxa" w:w="120"/>
+              <w:bottom w:type="dxa" w:w="80"/>
+              <w:right w:type="dxa" w:w="120"/>
+            </w:tcMar>
+          </w:tcPr>
+          <w:p>
+            <w:pPr>
+              <w:spacing w:after="0" w:line="240"/>
+            </w:pPr>
+            <w:r>
+              <w:rPr>
+                <w:sz w:val="19"/>
+                <w:szCs w:val="19"/>
+              </w:rPr>
+              <w:t xml:space="preserve">3 → 2</w:t>
+            </w:r>
+          </w:p>
+        </w:tc>
+      </w:tr>
+      <w:tr>
+        <w:tc>
+          <w:tcPr>
+            <w:tcW w:type="dxa" w:w="3100"/>
+            <w:tcMar>
+              <w:top w:type="dxa" w:w="80"/>
+              <w:left w:type="dxa" w:w="120"/>
+              <w:bottom w:type="dxa" w:w="80"/>
+              <w:right w:type="dxa" w:w="120"/>
+            </w:tcMar>
+          </w:tcPr>
+          <w:p>
+            <w:pPr>
+              <w:spacing w:after="0" w:line="240"/>
+            </w:pPr>
+            <w:r>
+              <w:rPr>
+                <w:sz w:val="19"/>
+                <w:szCs w:val="19"/>
+              </w:rPr>
+              <w:t xml:space="preserve">Borrar un préstamo abierto</w:t>
+            </w:r>
+          </w:p>
+        </w:tc>
+        <w:tc>
+          <w:tcPr>
+            <w:tcW w:type="dxa" w:w="2900"/>
+            <w:tcMar>
+              <w:top w:type="dxa" w:w="80"/>
+              <w:left w:type="dxa" w:w="120"/>
+              <w:bottom w:type="dxa" w:w="80"/>
+              <w:right w:type="dxa" w:w="120"/>
+            </w:tcMar>
+          </w:tcPr>
+          <w:p>
+            <w:pPr>
+              <w:spacing w:after="0" w:line="240"/>
+            </w:pPr>
+            <w:r>
+              <w:rPr>
+                <w:sz w:val="19"/>
+                <w:szCs w:val="19"/>
+              </w:rPr>
+              <w:t xml:space="preserve">El ejemplar se reintegra</w:t>
+            </w:r>
+          </w:p>
+        </w:tc>
+        <w:tc>
+          <w:tcPr>
+            <w:tcW w:type="dxa" w:w="3360"/>
+            <w:tcMar>
+              <w:top w:type="dxa" w:w="80"/>
+              <w:left w:type="dxa" w:w="120"/>
+              <w:bottom w:type="dxa" w:w="80"/>
+              <w:right w:type="dxa" w:w="120"/>
+            </w:tcMar>
+          </w:tcPr>
+          <w:p>
+            <w:pPr>
+              <w:spacing w:after="0" w:line="240"/>
+            </w:pPr>
+            <w:r>
+              <w:rPr>
+                <w:sz w:val="19"/>
+                <w:szCs w:val="19"/>
+              </w:rPr>
+              <w:t xml:space="preserve">2 → 3</w:t>
+            </w:r>
+          </w:p>
+        </w:tc>
+      </w:tr>
+      <w:tr>
+        <w:tc>
+          <w:tcPr>
+            <w:tcW w:type="dxa" w:w="3100"/>
+            <w:tcMar>
+              <w:top w:type="dxa" w:w="80"/>
+              <w:left w:type="dxa" w:w="120"/>
+              <w:bottom w:type="dxa" w:w="80"/>
+              <w:right w:type="dxa" w:w="120"/>
+            </w:tcMar>
+          </w:tcPr>
+          <w:p>
+            <w:pPr>
+              <w:spacing w:after="0" w:line="240"/>
+            </w:pPr>
+            <w:r>
+              <w:rPr>
+                <w:sz w:val="19"/>
+                <w:szCs w:val="19"/>
+              </w:rPr>
+              <w:t xml:space="preserve">Enviar una fecha límite falsa (año 2099)</w:t>
+            </w:r>
+          </w:p>
+        </w:tc>
+        <w:tc>
+          <w:tcPr>
+            <w:tcW w:type="dxa" w:w="2900"/>
+            <w:tcMar>
+              <w:top w:type="dxa" w:w="80"/>
+              <w:left w:type="dxa" w:w="120"/>
+              <w:bottom w:type="dxa" w:w="80"/>
+              <w:right w:type="dxa" w:w="120"/>
+            </w:tcMar>
+          </w:tcPr>
+          <w:p>
+            <w:pPr>
+              <w:spacing w:after="0" w:line="240"/>
+            </w:pPr>
+            <w:r>
+              <w:rPr>
+                <w:sz w:val="19"/>
+                <w:szCs w:val="19"/>
+              </w:rPr>
+              <w:t xml:space="preserve">La base impone siete días</w:t>
+            </w:r>
+          </w:p>
+        </w:tc>
+        <w:tc>
+          <w:tcPr>
+            <w:tcW w:type="dxa" w:w="3360"/>
+            <w:tcMar>
+              <w:top w:type="dxa" w:w="80"/>
+              <w:left w:type="dxa" w:w="120"/>
+              <w:bottom w:type="dxa" w:w="80"/>
+              <w:right w:type="dxa" w:w="120"/>
+            </w:tcMar>
+          </w:tcPr>
+          <w:p>
+            <w:pPr>
+              <w:spacing w:after="0" w:line="240"/>
+            </w:pPr>
+            <w:r>
+              <w:rPr>
+                <w:sz w:val="19"/>
+                <w:szCs w:val="19"/>
+              </w:rPr>
+              <w:t xml:space="preserve">Guardó el 29/09/2026</w:t>
+            </w:r>
+          </w:p>
+        </w:tc>
+      </w:tr>
+      <w:tr>
+        <w:tc>
+          <w:tcPr>
+            <w:tcW w:type="dxa" w:w="3100"/>
+            <w:tcMar>
+              <w:top w:type="dxa" w:w="80"/>
+              <w:left w:type="dxa" w:w="120"/>
+              <w:bottom w:type="dxa" w:w="80"/>
+              <w:right w:type="dxa" w:w="120"/>
+            </w:tcMar>
+          </w:tcPr>
+          <w:p>
+            <w:pPr>
+              <w:spacing w:after="0" w:line="240"/>
+            </w:pPr>
+            <w:r>
+              <w:rPr>
+                <w:sz w:val="19"/>
+                <w:szCs w:val="19"/>
+              </w:rPr>
+              <w:t xml:space="preserve">Prestar a quien ya tiene un préstamo</w:t>
+            </w:r>
+          </w:p>
+        </w:tc>
+        <w:tc>
+          <w:tcPr>
+            <w:tcW w:type="dxa" w:w="2900"/>
+            <w:tcMar>
+              <w:top w:type="dxa" w:w="80"/>
+              <w:left w:type="dxa" w:w="120"/>
+              <w:bottom w:type="dxa" w:w="80"/>
+              <w:right w:type="dxa" w:w="120"/>
+            </w:tcMar>
+          </w:tcPr>
+          <w:p>
+            <w:pPr>
+              <w:spacing w:after="0" w:line="240"/>
+            </w:pPr>
+            <w:r>
+              <w:rPr>
+                <w:sz w:val="19"/>
+                <w:szCs w:val="19"/>
+              </w:rPr>
+              <w:t xml:space="preserve">Rechazo con mensaje propio</w:t>
+            </w:r>
+          </w:p>
+        </w:tc>
+        <w:tc>
+          <w:tcPr>
+            <w:tcW w:type="dxa" w:w="3360"/>
+            <w:tcMar>
+              <w:top w:type="dxa" w:w="80"/>
+              <w:left w:type="dxa" w:w="120"/>
+              <w:bottom w:type="dxa" w:w="80"/>
+              <w:right w:type="dxa" w:w="120"/>
+            </w:tcMar>
+          </w:tcPr>
+          <w:p>
+            <w:pPr>
+              <w:spacing w:after="0" w:line="240"/>
+            </w:pPr>
+            <w:r>
+              <w:rPr>
+                <w:sz w:val="19"/>
+                <w:szCs w:val="19"/>
+              </w:rPr>
+              <w:t xml:space="preserve">«Este alumno ya tiene un préstamo activo»</w:t>
+            </w:r>
+          </w:p>
+        </w:tc>
+      </w:tr>
+      <w:tr>
+        <w:tc>
+          <w:tcPr>
+            <w:tcW w:type="dxa" w:w="3100"/>
+            <w:tcMar>
+              <w:top w:type="dxa" w:w="80"/>
+              <w:left w:type="dxa" w:w="120"/>
+              <w:bottom w:type="dxa" w:w="80"/>
+              <w:right w:type="dxa" w:w="120"/>
+            </w:tcMar>
+          </w:tcPr>
+          <w:p>
+            <w:pPr>
+              <w:spacing w:after="0" w:line="240"/>
+            </w:pPr>
+            <w:r>
+              <w:rPr>
+                <w:sz w:val="19"/>
+                <w:szCs w:val="19"/>
+              </w:rPr>
+              <w:t xml:space="preserve">Bibliotecario crea un administrador</w:t>
+            </w:r>
+          </w:p>
+        </w:tc>
+        <w:tc>
+          <w:tcPr>
+            <w:tcW w:type="dxa" w:w="2900"/>
+            <w:tcMar>
+              <w:top w:type="dxa" w:w="80"/>
+              <w:left w:type="dxa" w:w="120"/>
+              <w:bottom w:type="dxa" w:w="80"/>
+              <w:right w:type="dxa" w:w="120"/>
+            </w:tcMar>
+          </w:tcPr>
+          <w:p>
+            <w:pPr>
+              <w:spacing w:after="0" w:line="240"/>
+            </w:pPr>
+            <w:r>
+              <w:rPr>
+                <w:sz w:val="19"/>
+                <w:szCs w:val="19"/>
+              </w:rPr>
+              <w:t xml:space="preserve">Rechazo</w:t>
+            </w:r>
+          </w:p>
+        </w:tc>
+        <w:tc>
+          <w:tcPr>
+            <w:tcW w:type="dxa" w:w="3360"/>
+            <w:tcMar>
+              <w:top w:type="dxa" w:w="80"/>
+              <w:left w:type="dxa" w:w="120"/>
+              <w:bottom w:type="dxa" w:w="80"/>
+              <w:right w:type="dxa" w:w="120"/>
+            </w:tcMar>
+          </w:tcPr>
+          <w:p>
+            <w:pPr>
+              <w:spacing w:after="0" w:line="240"/>
+            </w:pPr>
+            <w:r>
+              <w:rPr>
+                <w:sz w:val="19"/>
+                <w:szCs w:val="19"/>
+              </w:rPr>
+              <w:t xml:space="preserve">«Solo un administrador puede registrar a otro administrador»</w:t>
+            </w:r>
+          </w:p>
+        </w:tc>
+      </w:tr>
+      <w:tr>
+        <w:tc>
+          <w:tcPr>
+            <w:tcW w:type="dxa" w:w="3100"/>
+            <w:tcMar>
+              <w:top w:type="dxa" w:w="80"/>
+              <w:left w:type="dxa" w:w="120"/>
+              <w:bottom w:type="dxa" w:w="80"/>
+              <w:right w:type="dxa" w:w="120"/>
+            </w:tcMar>
+          </w:tcPr>
+          <w:p>
+            <w:pPr>
+              <w:spacing w:after="0" w:line="240"/>
+            </w:pPr>
+            <w:r>
+              <w:rPr>
+                <w:sz w:val="19"/>
+                <w:szCs w:val="19"/>
+              </w:rPr>
+              <w:t xml:space="preserve">Administrador cambia su propio perfil</w:t>
+            </w:r>
+          </w:p>
+        </w:tc>
+        <w:tc>
+          <w:tcPr>
+            <w:tcW w:type="dxa" w:w="2900"/>
+            <w:tcMar>
+              <w:top w:type="dxa" w:w="80"/>
+              <w:left w:type="dxa" w:w="120"/>
+              <w:bottom w:type="dxa" w:w="80"/>
+              <w:right w:type="dxa" w:w="120"/>
+            </w:tcMar>
+          </w:tcPr>
+          <w:p>
+            <w:pPr>
+              <w:spacing w:after="0" w:line="240"/>
+            </w:pPr>
+            <w:r>
+              <w:rPr>
+                <w:sz w:val="19"/>
+                <w:szCs w:val="19"/>
+              </w:rPr>
+              <w:t xml:space="preserve">Rechazo</w:t>
+            </w:r>
+          </w:p>
+        </w:tc>
+        <w:tc>
+          <w:tcPr>
+            <w:tcW w:type="dxa" w:w="3360"/>
+            <w:tcMar>
+              <w:top w:type="dxa" w:w="80"/>
+              <w:left w:type="dxa" w:w="120"/>
+              <w:bottom w:type="dxa" w:w="80"/>
+              <w:right w:type="dxa" w:w="120"/>
+            </w:tcMar>
+          </w:tcPr>
+          <w:p>
+            <w:pPr>
+              <w:spacing w:after="0" w:line="240"/>
+            </w:pPr>
+            <w:r>
+              <w:rPr>
+                <w:sz w:val="19"/>
+                <w:szCs w:val="19"/>
+              </w:rPr>
+              <w:t xml:space="preserve">«No puedes cambiar tu propio perfil de acceso»</w:t>
+            </w:r>
+          </w:p>
+        </w:tc>
+      </w:tr>
+      <w:tr>
+        <w:tc>
+          <w:tcPr>
+            <w:tcW w:type="dxa" w:w="3100"/>
+            <w:tcMar>
+              <w:top w:type="dxa" w:w="80"/>
+              <w:left w:type="dxa" w:w="120"/>
+              <w:bottom w:type="dxa" w:w="80"/>
+              <w:right w:type="dxa" w:w="120"/>
+            </w:tcMar>
+          </w:tcPr>
+          <w:p>
+            <w:pPr>
+              <w:spacing w:after="0" w:line="240"/>
+            </w:pPr>
+            <w:r>
+              <w:rPr>
+                <w:sz w:val="19"/>
+                <w:szCs w:val="19"/>
+              </w:rPr>
+              <w:t xml:space="preserve">Bibliotecario registra a un bibliotecario</w:t>
+            </w:r>
+          </w:p>
+        </w:tc>
+        <w:tc>
+          <w:tcPr>
+            <w:tcW w:type="dxa" w:w="2900"/>
+            <w:tcMar>
+              <w:top w:type="dxa" w:w="80"/>
+              <w:left w:type="dxa" w:w="120"/>
+              <w:bottom w:type="dxa" w:w="80"/>
+              <w:right w:type="dxa" w:w="120"/>
+            </w:tcMar>
+          </w:tcPr>
+          <w:p>
+            <w:pPr>
+              <w:spacing w:after="0" w:line="240"/>
+            </w:pPr>
+            <w:r>
+              <w:rPr>
+                <w:sz w:val="19"/>
+                <w:szCs w:val="19"/>
+              </w:rPr>
+              <w:t xml:space="preserve">Permitido</w:t>
+            </w:r>
+          </w:p>
+        </w:tc>
+        <w:tc>
+          <w:tcPr>
+            <w:tcW w:type="dxa" w:w="3360"/>
+            <w:tcMar>
+              <w:top w:type="dxa" w:w="80"/>
+              <w:left w:type="dxa" w:w="120"/>
+              <w:bottom w:type="dxa" w:w="80"/>
+              <w:right w:type="dxa" w:w="120"/>
+            </w:tcMar>
+          </w:tcPr>
+          <w:p>
+            <w:pPr>
+              <w:spacing w:after="0" w:line="240"/>
+            </w:pPr>
+            <w:r>
+              <w:rPr>
+                <w:sz w:val="19"/>
+                <w:szCs w:val="19"/>
+              </w:rPr>
+              <w:t xml:space="preserve">Permitido</w:t>
+            </w:r>
+          </w:p>
+        </w:tc>
+      </w:tr>
+    </w:tbl>
+    <w:p>
+      <w:pPr>
+        <w:spacing w:after="220" w:line="276"/>
+        <w:jc w:val="center"/>
+      </w:pPr>
+      <w:r>
+        <w:rPr>
+          <w:i/>
+          <w:iCs/>
+          <w:color w:val="5D6675"/>
+          <w:sz w:val="18"/>
+          <w:szCs w:val="18"/>
+        </w:rPr>
+        <w:t xml:space="preserve">Tabla 2. Pruebas ejecutadas contra la base en operación.</w:t>
+      </w:r>
+    </w:p>
+    <w:p>
+      <w:r>
+        <w:br w:type="page"/>
+      </w:r>
+    </w:p>
+    <w:p>
+      <w:pPr>
+        <w:pStyle w:val="Heading1"/>
+        <w:spacing w:after="180" w:before="360"/>
+      </w:pPr>
+      <w:r>
+        <w:t xml:space="preserve">7. Diseño de interfaces y prototipo</w:t>
+      </w:r>
+    </w:p>
+    <w:p>
+      <w:pPr>
+        <w:spacing w:after="120" w:line="276"/>
+      </w:pPr>
+      <w:r>
+        <w:rPr>
+          <w:sz w:val="22"/>
+          <w:szCs w:val="22"/>
+        </w:rPr>
+        <w:t xml:space="preserve">El prototipo es funcional: las capturas que siguen se tomaron de la aplicación en ejecución, conectada a la base de datos real. La aplicación de escritorio está construida con PySide6 y sus once pantallas se diseñan en un editor visual, de modo que la disposición vive en archivos separados del código.</w:t>
+      </w:r>
+    </w:p>
+    <w:p>
+      <w:pPr>
+        <w:pStyle w:val="Heading2"/>
+        <w:spacing w:after="140" w:before="280"/>
+      </w:pPr>
+      <w:r>
+        <w:t xml:space="preserve">7.1 Navegación</w:t>
+      </w:r>
+    </w:p>
+    <w:p>
+      <w:pPr>
+        <w:spacing w:after="120" w:line="276"/>
+      </w:pPr>
+      <w:r>
+        <w:rPr>
+          <w:sz w:val="22"/>
+          <w:szCs w:val="22"/>
+        </w:rPr>
+        <w:t xml:space="preserve">El acceso es una sola puerta y el resto del sistema son cinco pestañas dentro de una misma ventana, más cinco diálogos que se abren sobre ella. No hay menús anidados: una biblioteca escolar atendida por un docente con su propio grupo a cargo no puede permitirse que una operación esté a tres niveles de profundidad.</w:t>
+      </w:r>
+    </w:p>
+    <w:p>
+      <w:pPr>
+        <w:spacing w:after="160" w:line="276"/>
+      </w:pPr>
+      <w:r>
+        <w:rPr>
+          <w:sz w:val="22"/>
+          <w:szCs w:val="22"/>
+        </w:rPr>
+        <w:t xml:space="preserve"/>
+      </w:r>
+    </w:p>
+    <w:tbl>
+      <w:tblPr>
+        <w:tblW w:type="dxa" w:w="9360"/>
+        <w:tblBorders>
+          <w:top w:val="single" w:color="auto" w:sz="4"/>
+          <w:left w:val="single" w:color="auto" w:sz="4"/>
+          <w:bottom w:val="single" w:color="auto" w:sz="4"/>
+          <w:right w:val="single" w:color="auto" w:sz="4"/>
+          <w:insideH w:val="single" w:color="auto" w:sz="4"/>
+          <w:insideV w:val="single" w:color="auto" w:sz="4"/>
+        </w:tblBorders>
+      </w:tblPr>
+      <w:tblGrid>
+        <w:gridCol w:w="2000"/>
+        <w:gridCol w:w="2600"/>
+        <w:gridCol w:w="4760"/>
+      </w:tblGrid>
+      <w:tr>
+        <w:trPr>
+          <w:tblHeader/>
+        </w:trPr>
+        <w:tc>
+          <w:tcPr>
+            <w:tcW w:type="dxa" w:w="2000"/>
+            <w:shd w:fill="E7EBF1" w:val="clear"/>
+            <w:tcMar>
+              <w:top w:type="dxa" w:w="80"/>
+              <w:left w:type="dxa" w:w="120"/>
+              <w:bottom w:type="dxa" w:w="80"/>
+              <w:right w:type="dxa" w:w="120"/>
+            </w:tcMar>
+          </w:tcPr>
+          <w:p>
+            <w:pPr>
+              <w:spacing w:after="0" w:line="240"/>
+            </w:pPr>
+            <w:r>
+              <w:rPr>
+                <w:b/>
+                <w:bCs/>
+                <w:color w:val="2D4B73"/>
+                <w:sz w:val="19"/>
+                <w:szCs w:val="19"/>
+              </w:rPr>
+              <w:t xml:space="preserve">Pantalla</w:t>
+            </w:r>
+          </w:p>
+        </w:tc>
+        <w:tc>
+          <w:tcPr>
+            <w:tcW w:type="dxa" w:w="2600"/>
+            <w:shd w:fill="E7EBF1" w:val="clear"/>
+            <w:tcMar>
+              <w:top w:type="dxa" w:w="80"/>
+              <w:left w:type="dxa" w:w="120"/>
+              <w:bottom w:type="dxa" w:w="80"/>
+              <w:right w:type="dxa" w:w="120"/>
+            </w:tcMar>
+          </w:tcPr>
+          <w:p>
+            <w:pPr>
+              <w:spacing w:after="0" w:line="240"/>
+            </w:pPr>
+            <w:r>
+              <w:rPr>
+                <w:b/>
+                <w:bCs/>
+                <w:color w:val="2D4B73"/>
+                <w:sz w:val="19"/>
+                <w:szCs w:val="19"/>
+              </w:rPr>
+              <w:t xml:space="preserve">Cómo se llega</w:t>
+            </w:r>
+          </w:p>
+        </w:tc>
+        <w:tc>
+          <w:tcPr>
+            <w:tcW w:type="dxa" w:w="4760"/>
+            <w:shd w:fill="E7EBF1" w:val="clear"/>
+            <w:tcMar>
+              <w:top w:type="dxa" w:w="80"/>
+              <w:left w:type="dxa" w:w="120"/>
+              <w:bottom w:type="dxa" w:w="80"/>
+              <w:right w:type="dxa" w:w="120"/>
+            </w:tcMar>
+          </w:tcPr>
+          <w:p>
+            <w:pPr>
+              <w:spacing w:after="0" w:line="240"/>
+            </w:pPr>
+            <w:r>
+              <w:rPr>
+                <w:b/>
+                <w:bCs/>
+                <w:color w:val="2D4B73"/>
+                <w:sz w:val="19"/>
+                <w:szCs w:val="19"/>
+              </w:rPr>
+              <w:t xml:space="preserve">Qué permite</w:t>
+            </w:r>
+          </w:p>
+        </w:tc>
+      </w:tr>
+      <w:tr>
+        <w:tc>
+          <w:tcPr>
+            <w:tcW w:type="dxa" w:w="2000"/>
+            <w:tcMar>
+              <w:top w:type="dxa" w:w="80"/>
+              <w:left w:type="dxa" w:w="120"/>
+              <w:bottom w:type="dxa" w:w="80"/>
+              <w:right w:type="dxa" w:w="120"/>
+            </w:tcMar>
+          </w:tcPr>
+          <w:p>
+            <w:pPr>
+              <w:spacing w:after="0" w:line="240"/>
+            </w:pPr>
+            <w:r>
+              <w:rPr>
+                <w:sz w:val="19"/>
+                <w:szCs w:val="19"/>
+              </w:rPr>
+              <w:t xml:space="preserve">Acceso</w:t>
+            </w:r>
+          </w:p>
+        </w:tc>
+        <w:tc>
+          <w:tcPr>
+            <w:tcW w:type="dxa" w:w="2600"/>
+            <w:tcMar>
+              <w:top w:type="dxa" w:w="80"/>
+              <w:left w:type="dxa" w:w="120"/>
+              <w:bottom w:type="dxa" w:w="80"/>
+              <w:right w:type="dxa" w:w="120"/>
+            </w:tcMar>
+          </w:tcPr>
+          <w:p>
+            <w:pPr>
+              <w:spacing w:after="0" w:line="240"/>
+            </w:pPr>
+            <w:r>
+              <w:rPr>
+                <w:sz w:val="19"/>
+                <w:szCs w:val="19"/>
+              </w:rPr>
+              <w:t xml:space="preserve">Al abrir la aplicación</w:t>
+            </w:r>
+          </w:p>
+        </w:tc>
+        <w:tc>
+          <w:tcPr>
+            <w:tcW w:type="dxa" w:w="4760"/>
+            <w:tcMar>
+              <w:top w:type="dxa" w:w="80"/>
+              <w:left w:type="dxa" w:w="120"/>
+              <w:bottom w:type="dxa" w:w="80"/>
+              <w:right w:type="dxa" w:w="120"/>
+            </w:tcMar>
+          </w:tcPr>
+          <w:p>
+            <w:pPr>
+              <w:spacing w:after="0" w:line="240"/>
+            </w:pPr>
+            <w:r>
+              <w:rPr>
+                <w:sz w:val="19"/>
+                <w:szCs w:val="19"/>
+              </w:rPr>
+              <w:t xml:space="preserve">Iniciar sesión con correo y contraseña</w:t>
+            </w:r>
+          </w:p>
+        </w:tc>
+      </w:tr>
+      <w:tr>
+        <w:tc>
+          <w:tcPr>
+            <w:tcW w:type="dxa" w:w="2000"/>
+            <w:tcMar>
+              <w:top w:type="dxa" w:w="80"/>
+              <w:left w:type="dxa" w:w="120"/>
+              <w:bottom w:type="dxa" w:w="80"/>
+              <w:right w:type="dxa" w:w="120"/>
+            </w:tcMar>
+          </w:tcPr>
+          <w:p>
+            <w:pPr>
+              <w:spacing w:after="0" w:line="240"/>
+            </w:pPr>
+            <w:r>
+              <w:rPr>
+                <w:sz w:val="19"/>
+                <w:szCs w:val="19"/>
+              </w:rPr>
+              <w:t xml:space="preserve">Catálogo</w:t>
+            </w:r>
+          </w:p>
+        </w:tc>
+        <w:tc>
+          <w:tcPr>
+            <w:tcW w:type="dxa" w:w="2600"/>
+            <w:tcMar>
+              <w:top w:type="dxa" w:w="80"/>
+              <w:left w:type="dxa" w:w="120"/>
+              <w:bottom w:type="dxa" w:w="80"/>
+              <w:right w:type="dxa" w:w="120"/>
+            </w:tcMar>
+          </w:tcPr>
+          <w:p>
+            <w:pPr>
+              <w:spacing w:after="0" w:line="240"/>
+            </w:pPr>
+            <w:r>
+              <w:rPr>
+                <w:sz w:val="19"/>
+                <w:szCs w:val="19"/>
+              </w:rPr>
+              <w:t xml:space="preserve">Pestaña</w:t>
+            </w:r>
+          </w:p>
+        </w:tc>
+        <w:tc>
+          <w:tcPr>
+            <w:tcW w:type="dxa" w:w="4760"/>
+            <w:tcMar>
+              <w:top w:type="dxa" w:w="80"/>
+              <w:left w:type="dxa" w:w="120"/>
+              <w:bottom w:type="dxa" w:w="80"/>
+              <w:right w:type="dxa" w:w="120"/>
+            </w:tcMar>
+          </w:tcPr>
+          <w:p>
+            <w:pPr>
+              <w:spacing w:after="0" w:line="240"/>
+            </w:pPr>
+            <w:r>
+              <w:rPr>
+                <w:sz w:val="19"/>
+                <w:szCs w:val="19"/>
+              </w:rPr>
+              <w:t xml:space="preserve">Buscar, dar de alta, modificar y dar de baja libros</w:t>
+            </w:r>
+          </w:p>
+        </w:tc>
+      </w:tr>
+      <w:tr>
+        <w:tc>
+          <w:tcPr>
+            <w:tcW w:type="dxa" w:w="2000"/>
+            <w:tcMar>
+              <w:top w:type="dxa" w:w="80"/>
+              <w:left w:type="dxa" w:w="120"/>
+              <w:bottom w:type="dxa" w:w="80"/>
+              <w:right w:type="dxa" w:w="120"/>
+            </w:tcMar>
+          </w:tcPr>
+          <w:p>
+            <w:pPr>
+              <w:spacing w:after="0" w:line="240"/>
+            </w:pPr>
+            <w:r>
+              <w:rPr>
+                <w:sz w:val="19"/>
+                <w:szCs w:val="19"/>
+              </w:rPr>
+              <w:t xml:space="preserve">Préstamos</w:t>
+            </w:r>
+          </w:p>
+        </w:tc>
+        <w:tc>
+          <w:tcPr>
+            <w:tcW w:type="dxa" w:w="2600"/>
+            <w:tcMar>
+              <w:top w:type="dxa" w:w="80"/>
+              <w:left w:type="dxa" w:w="120"/>
+              <w:bottom w:type="dxa" w:w="80"/>
+              <w:right w:type="dxa" w:w="120"/>
+            </w:tcMar>
+          </w:tcPr>
+          <w:p>
+            <w:pPr>
+              <w:spacing w:after="0" w:line="240"/>
+            </w:pPr>
+            <w:r>
+              <w:rPr>
+                <w:sz w:val="19"/>
+                <w:szCs w:val="19"/>
+              </w:rPr>
+              <w:t xml:space="preserve">Pestaña</w:t>
+            </w:r>
+          </w:p>
+        </w:tc>
+        <w:tc>
+          <w:tcPr>
+            <w:tcW w:type="dxa" w:w="4760"/>
+            <w:tcMar>
+              <w:top w:type="dxa" w:w="80"/>
+              <w:left w:type="dxa" w:w="120"/>
+              <w:bottom w:type="dxa" w:w="80"/>
+              <w:right w:type="dxa" w:w="120"/>
+            </w:tcMar>
+          </w:tcPr>
+          <w:p>
+            <w:pPr>
+              <w:spacing w:after="0" w:line="240"/>
+            </w:pPr>
+            <w:r>
+              <w:rPr>
+                <w:sz w:val="19"/>
+                <w:szCs w:val="19"/>
+              </w:rPr>
+              <w:t xml:space="preserve">Ver los préstamos abiertos, filtrar vencidos, prestar y registrar devoluciones</w:t>
+            </w:r>
+          </w:p>
+        </w:tc>
+      </w:tr>
+      <w:tr>
+        <w:tc>
+          <w:tcPr>
+            <w:tcW w:type="dxa" w:w="2000"/>
+            <w:tcMar>
+              <w:top w:type="dxa" w:w="80"/>
+              <w:left w:type="dxa" w:w="120"/>
+              <w:bottom w:type="dxa" w:w="80"/>
+              <w:right w:type="dxa" w:w="120"/>
+            </w:tcMar>
+          </w:tcPr>
+          <w:p>
+            <w:pPr>
+              <w:spacing w:after="0" w:line="240"/>
+            </w:pPr>
+            <w:r>
+              <w:rPr>
+                <w:sz w:val="19"/>
+                <w:szCs w:val="19"/>
+              </w:rPr>
+              <w:t xml:space="preserve">Alumnos</w:t>
+            </w:r>
+          </w:p>
+        </w:tc>
+        <w:tc>
+          <w:tcPr>
+            <w:tcW w:type="dxa" w:w="2600"/>
+            <w:tcMar>
+              <w:top w:type="dxa" w:w="80"/>
+              <w:left w:type="dxa" w:w="120"/>
+              <w:bottom w:type="dxa" w:w="80"/>
+              <w:right w:type="dxa" w:w="120"/>
+            </w:tcMar>
+          </w:tcPr>
+          <w:p>
+            <w:pPr>
+              <w:spacing w:after="0" w:line="240"/>
+            </w:pPr>
+            <w:r>
+              <w:rPr>
+                <w:sz w:val="19"/>
+                <w:szCs w:val="19"/>
+              </w:rPr>
+              <w:t xml:space="preserve">Pestaña</w:t>
+            </w:r>
+          </w:p>
+        </w:tc>
+        <w:tc>
+          <w:tcPr>
+            <w:tcW w:type="dxa" w:w="4760"/>
+            <w:tcMar>
+              <w:top w:type="dxa" w:w="80"/>
+              <w:left w:type="dxa" w:w="120"/>
+              <w:bottom w:type="dxa" w:w="80"/>
+              <w:right w:type="dxa" w:w="120"/>
+            </w:tcMar>
+          </w:tcPr>
+          <w:p>
+            <w:pPr>
+              <w:spacing w:after="0" w:line="240"/>
+            </w:pPr>
+            <w:r>
+              <w:rPr>
+                <w:sz w:val="19"/>
+                <w:szCs w:val="19"/>
+              </w:rPr>
+              <w:t xml:space="preserve">Padrón, alta, modificación e historial de cada alumno</w:t>
+            </w:r>
+          </w:p>
+        </w:tc>
+      </w:tr>
+      <w:tr>
+        <w:tc>
+          <w:tcPr>
+            <w:tcW w:type="dxa" w:w="2000"/>
+            <w:tcMar>
+              <w:top w:type="dxa" w:w="80"/>
+              <w:left w:type="dxa" w:w="120"/>
+              <w:bottom w:type="dxa" w:w="80"/>
+              <w:right w:type="dxa" w:w="120"/>
+            </w:tcMar>
+          </w:tcPr>
+          <w:p>
+            <w:pPr>
+              <w:spacing w:after="0" w:line="240"/>
+            </w:pPr>
+            <w:r>
+              <w:rPr>
+                <w:sz w:val="19"/>
+                <w:szCs w:val="19"/>
+              </w:rPr>
+              <w:t xml:space="preserve">Deudores</w:t>
+            </w:r>
+          </w:p>
+        </w:tc>
+        <w:tc>
+          <w:tcPr>
+            <w:tcW w:type="dxa" w:w="2600"/>
+            <w:tcMar>
+              <w:top w:type="dxa" w:w="80"/>
+              <w:left w:type="dxa" w:w="120"/>
+              <w:bottom w:type="dxa" w:w="80"/>
+              <w:right w:type="dxa" w:w="120"/>
+            </w:tcMar>
+          </w:tcPr>
+          <w:p>
+            <w:pPr>
+              <w:spacing w:after="0" w:line="240"/>
+            </w:pPr>
+            <w:r>
+              <w:rPr>
+                <w:sz w:val="19"/>
+                <w:szCs w:val="19"/>
+              </w:rPr>
+              <w:t xml:space="preserve">Pestaña</w:t>
+            </w:r>
+          </w:p>
+        </w:tc>
+        <w:tc>
+          <w:tcPr>
+            <w:tcW w:type="dxa" w:w="4760"/>
+            <w:tcMar>
+              <w:top w:type="dxa" w:w="80"/>
+              <w:left w:type="dxa" w:w="120"/>
+              <w:bottom w:type="dxa" w:w="80"/>
+              <w:right w:type="dxa" w:w="120"/>
+            </w:tcMar>
+          </w:tcPr>
+          <w:p>
+            <w:pPr>
+              <w:spacing w:after="0" w:line="240"/>
+            </w:pPr>
+            <w:r>
+              <w:rPr>
+                <w:sz w:val="19"/>
+                <w:szCs w:val="19"/>
+              </w:rPr>
+              <w:t xml:space="preserve">Reporte de quién debe, desde cuándo y cómo localizar al tutor</w:t>
+            </w:r>
+          </w:p>
+        </w:tc>
+      </w:tr>
+      <w:tr>
+        <w:tc>
+          <w:tcPr>
+            <w:tcW w:type="dxa" w:w="2000"/>
+            <w:tcMar>
+              <w:top w:type="dxa" w:w="80"/>
+              <w:left w:type="dxa" w:w="120"/>
+              <w:bottom w:type="dxa" w:w="80"/>
+              <w:right w:type="dxa" w:w="120"/>
+            </w:tcMar>
+          </w:tcPr>
+          <w:p>
+            <w:pPr>
+              <w:spacing w:after="0" w:line="240"/>
+            </w:pPr>
+            <w:r>
+              <w:rPr>
+                <w:sz w:val="19"/>
+                <w:szCs w:val="19"/>
+              </w:rPr>
+              <w:t xml:space="preserve">Empleados</w:t>
+            </w:r>
+          </w:p>
+        </w:tc>
+        <w:tc>
+          <w:tcPr>
+            <w:tcW w:type="dxa" w:w="2600"/>
+            <w:tcMar>
+              <w:top w:type="dxa" w:w="80"/>
+              <w:left w:type="dxa" w:w="120"/>
+              <w:bottom w:type="dxa" w:w="80"/>
+              <w:right w:type="dxa" w:w="120"/>
+            </w:tcMar>
+          </w:tcPr>
+          <w:p>
+            <w:pPr>
+              <w:spacing w:after="0" w:line="240"/>
+            </w:pPr>
+            <w:r>
+              <w:rPr>
+                <w:sz w:val="19"/>
+                <w:szCs w:val="19"/>
+              </w:rPr>
+              <w:t xml:space="preserve">Pestaña</w:t>
+            </w:r>
+          </w:p>
+        </w:tc>
+        <w:tc>
+          <w:tcPr>
+            <w:tcW w:type="dxa" w:w="4760"/>
+            <w:tcMar>
+              <w:top w:type="dxa" w:w="80"/>
+              <w:left w:type="dxa" w:w="120"/>
+              <w:bottom w:type="dxa" w:w="80"/>
+              <w:right w:type="dxa" w:w="120"/>
+            </w:tcMar>
+          </w:tcPr>
+          <w:p>
+            <w:pPr>
+              <w:spacing w:after="0" w:line="240"/>
+            </w:pPr>
+            <w:r>
+              <w:rPr>
+                <w:sz w:val="19"/>
+                <w:szCs w:val="19"/>
+              </w:rPr>
+              <w:t xml:space="preserve">Plantilla del personal y alta de empleados</w:t>
+            </w:r>
+          </w:p>
+        </w:tc>
+      </w:tr>
+      <w:tr>
+        <w:tc>
+          <w:tcPr>
+            <w:tcW w:type="dxa" w:w="2000"/>
+            <w:tcMar>
+              <w:top w:type="dxa" w:w="80"/>
+              <w:left w:type="dxa" w:w="120"/>
+              <w:bottom w:type="dxa" w:w="80"/>
+              <w:right w:type="dxa" w:w="120"/>
+            </w:tcMar>
+          </w:tcPr>
+          <w:p>
+            <w:pPr>
+              <w:spacing w:after="0" w:line="240"/>
+            </w:pPr>
+            <w:r>
+              <w:rPr>
+                <w:sz w:val="19"/>
+                <w:szCs w:val="19"/>
+              </w:rPr>
+              <w:t xml:space="preserve">Nuevo préstamo</w:t>
+            </w:r>
+          </w:p>
+        </w:tc>
+        <w:tc>
+          <w:tcPr>
+            <w:tcW w:type="dxa" w:w="2600"/>
+            <w:tcMar>
+              <w:top w:type="dxa" w:w="80"/>
+              <w:left w:type="dxa" w:w="120"/>
+              <w:bottom w:type="dxa" w:w="80"/>
+              <w:right w:type="dxa" w:w="120"/>
+            </w:tcMar>
+          </w:tcPr>
+          <w:p>
+            <w:pPr>
+              <w:spacing w:after="0" w:line="240"/>
+            </w:pPr>
+            <w:r>
+              <w:rPr>
+                <w:sz w:val="19"/>
+                <w:szCs w:val="19"/>
+              </w:rPr>
+              <w:t xml:space="preserve">Diálogo desde Préstamos</w:t>
+            </w:r>
+          </w:p>
+        </w:tc>
+        <w:tc>
+          <w:tcPr>
+            <w:tcW w:type="dxa" w:w="4760"/>
+            <w:tcMar>
+              <w:top w:type="dxa" w:w="80"/>
+              <w:left w:type="dxa" w:w="120"/>
+              <w:bottom w:type="dxa" w:w="80"/>
+              <w:right w:type="dxa" w:w="120"/>
+            </w:tcMar>
+          </w:tcPr>
+          <w:p>
+            <w:pPr>
+              <w:spacing w:after="0" w:line="240"/>
+            </w:pPr>
+            <w:r>
+              <w:rPr>
+                <w:sz w:val="19"/>
+                <w:szCs w:val="19"/>
+              </w:rPr>
+              <w:t xml:space="preserve">Dos búsquedas y un botón</w:t>
+            </w:r>
+          </w:p>
+        </w:tc>
+      </w:tr>
+      <w:tr>
+        <w:tc>
+          <w:tcPr>
+            <w:tcW w:type="dxa" w:w="2000"/>
+            <w:tcMar>
+              <w:top w:type="dxa" w:w="80"/>
+              <w:left w:type="dxa" w:w="120"/>
+              <w:bottom w:type="dxa" w:w="80"/>
+              <w:right w:type="dxa" w:w="120"/>
+            </w:tcMar>
+          </w:tcPr>
+          <w:p>
+            <w:pPr>
+              <w:spacing w:after="0" w:line="240"/>
+            </w:pPr>
+            <w:r>
+              <w:rPr>
+                <w:sz w:val="19"/>
+                <w:szCs w:val="19"/>
+              </w:rPr>
+              <w:t xml:space="preserve">Formulario de libro</w:t>
+            </w:r>
+          </w:p>
+        </w:tc>
+        <w:tc>
+          <w:tcPr>
+            <w:tcW w:type="dxa" w:w="2600"/>
+            <w:tcMar>
+              <w:top w:type="dxa" w:w="80"/>
+              <w:left w:type="dxa" w:w="120"/>
+              <w:bottom w:type="dxa" w:w="80"/>
+              <w:right w:type="dxa" w:w="120"/>
+            </w:tcMar>
+          </w:tcPr>
+          <w:p>
+            <w:pPr>
+              <w:spacing w:after="0" w:line="240"/>
+            </w:pPr>
+            <w:r>
+              <w:rPr>
+                <w:sz w:val="19"/>
+                <w:szCs w:val="19"/>
+              </w:rPr>
+              <w:t xml:space="preserve">Diálogo desde Catálogo</w:t>
+            </w:r>
+          </w:p>
+        </w:tc>
+        <w:tc>
+          <w:tcPr>
+            <w:tcW w:type="dxa" w:w="4760"/>
+            <w:tcMar>
+              <w:top w:type="dxa" w:w="80"/>
+              <w:left w:type="dxa" w:w="120"/>
+              <w:bottom w:type="dxa" w:w="80"/>
+              <w:right w:type="dxa" w:w="120"/>
+            </w:tcMar>
+          </w:tcPr>
+          <w:p>
+            <w:pPr>
+              <w:spacing w:after="0" w:line="240"/>
+            </w:pPr>
+            <w:r>
+              <w:rPr>
+                <w:sz w:val="19"/>
+                <w:szCs w:val="19"/>
+              </w:rPr>
+              <w:t xml:space="preserve">Alta y modificación</w:t>
+            </w:r>
+          </w:p>
+        </w:tc>
+      </w:tr>
+      <w:tr>
+        <w:tc>
+          <w:tcPr>
+            <w:tcW w:type="dxa" w:w="2000"/>
+            <w:tcMar>
+              <w:top w:type="dxa" w:w="80"/>
+              <w:left w:type="dxa" w:w="120"/>
+              <w:bottom w:type="dxa" w:w="80"/>
+              <w:right w:type="dxa" w:w="120"/>
+            </w:tcMar>
+          </w:tcPr>
+          <w:p>
+            <w:pPr>
+              <w:spacing w:after="0" w:line="240"/>
+            </w:pPr>
+            <w:r>
+              <w:rPr>
+                <w:sz w:val="19"/>
+                <w:szCs w:val="19"/>
+              </w:rPr>
+              <w:t xml:space="preserve">Formulario de alumno</w:t>
+            </w:r>
+          </w:p>
+        </w:tc>
+        <w:tc>
+          <w:tcPr>
+            <w:tcW w:type="dxa" w:w="2600"/>
+            <w:tcMar>
+              <w:top w:type="dxa" w:w="80"/>
+              <w:left w:type="dxa" w:w="120"/>
+              <w:bottom w:type="dxa" w:w="80"/>
+              <w:right w:type="dxa" w:w="120"/>
+            </w:tcMar>
+          </w:tcPr>
+          <w:p>
+            <w:pPr>
+              <w:spacing w:after="0" w:line="240"/>
+            </w:pPr>
+            <w:r>
+              <w:rPr>
+                <w:sz w:val="19"/>
+                <w:szCs w:val="19"/>
+              </w:rPr>
+              <w:t xml:space="preserve">Diálogo desde Alumnos</w:t>
+            </w:r>
+          </w:p>
+        </w:tc>
+        <w:tc>
+          <w:tcPr>
+            <w:tcW w:type="dxa" w:w="4760"/>
+            <w:tcMar>
+              <w:top w:type="dxa" w:w="80"/>
+              <w:left w:type="dxa" w:w="120"/>
+              <w:bottom w:type="dxa" w:w="80"/>
+              <w:right w:type="dxa" w:w="120"/>
+            </w:tcMar>
+          </w:tcPr>
+          <w:p>
+            <w:pPr>
+              <w:spacing w:after="0" w:line="240"/>
+            </w:pPr>
+            <w:r>
+              <w:rPr>
+                <w:sz w:val="19"/>
+                <w:szCs w:val="19"/>
+              </w:rPr>
+              <w:t xml:space="preserve">Alta y modificación</w:t>
+            </w:r>
+          </w:p>
+        </w:tc>
+      </w:tr>
+      <w:tr>
+        <w:tc>
+          <w:tcPr>
+            <w:tcW w:type="dxa" w:w="2000"/>
+            <w:tcMar>
+              <w:top w:type="dxa" w:w="80"/>
+              <w:left w:type="dxa" w:w="120"/>
+              <w:bottom w:type="dxa" w:w="80"/>
+              <w:right w:type="dxa" w:w="120"/>
+            </w:tcMar>
+          </w:tcPr>
+          <w:p>
+            <w:pPr>
+              <w:spacing w:after="0" w:line="240"/>
+            </w:pPr>
+            <w:r>
+              <w:rPr>
+                <w:sz w:val="19"/>
+                <w:szCs w:val="19"/>
+              </w:rPr>
+              <w:t xml:space="preserve">Historial del alumno</w:t>
+            </w:r>
+          </w:p>
+        </w:tc>
+        <w:tc>
+          <w:tcPr>
+            <w:tcW w:type="dxa" w:w="2600"/>
+            <w:tcMar>
+              <w:top w:type="dxa" w:w="80"/>
+              <w:left w:type="dxa" w:w="120"/>
+              <w:bottom w:type="dxa" w:w="80"/>
+              <w:right w:type="dxa" w:w="120"/>
+            </w:tcMar>
+          </w:tcPr>
+          <w:p>
+            <w:pPr>
+              <w:spacing w:after="0" w:line="240"/>
+            </w:pPr>
+            <w:r>
+              <w:rPr>
+                <w:sz w:val="19"/>
+                <w:szCs w:val="19"/>
+              </w:rPr>
+              <w:t xml:space="preserve">Diálogo desde Alumnos</w:t>
+            </w:r>
+          </w:p>
+        </w:tc>
+        <w:tc>
+          <w:tcPr>
+            <w:tcW w:type="dxa" w:w="4760"/>
+            <w:tcMar>
+              <w:top w:type="dxa" w:w="80"/>
+              <w:left w:type="dxa" w:w="120"/>
+              <w:bottom w:type="dxa" w:w="80"/>
+              <w:right w:type="dxa" w:w="120"/>
+            </w:tcMar>
+          </w:tcPr>
+          <w:p>
+            <w:pPr>
+              <w:spacing w:after="0" w:line="240"/>
+            </w:pPr>
+            <w:r>
+              <w:rPr>
+                <w:sz w:val="19"/>
+                <w:szCs w:val="19"/>
+              </w:rPr>
+              <w:t xml:space="preserve">Todos sus préstamos, incluidos los concluidos</w:t>
+            </w:r>
+          </w:p>
+        </w:tc>
+      </w:tr>
+      <w:tr>
+        <w:tc>
+          <w:tcPr>
+            <w:tcW w:type="dxa" w:w="2000"/>
+            <w:tcMar>
+              <w:top w:type="dxa" w:w="80"/>
+              <w:left w:type="dxa" w:w="120"/>
+              <w:bottom w:type="dxa" w:w="80"/>
+              <w:right w:type="dxa" w:w="120"/>
+            </w:tcMar>
+          </w:tcPr>
+          <w:p>
+            <w:pPr>
+              <w:spacing w:after="0" w:line="240"/>
+            </w:pPr>
+            <w:r>
+              <w:rPr>
+                <w:sz w:val="19"/>
+                <w:szCs w:val="19"/>
+              </w:rPr>
+              <w:t xml:space="preserve">Formulario de empleado</w:t>
+            </w:r>
+          </w:p>
+        </w:tc>
+        <w:tc>
+          <w:tcPr>
+            <w:tcW w:type="dxa" w:w="2600"/>
+            <w:tcMar>
+              <w:top w:type="dxa" w:w="80"/>
+              <w:left w:type="dxa" w:w="120"/>
+              <w:bottom w:type="dxa" w:w="80"/>
+              <w:right w:type="dxa" w:w="120"/>
+            </w:tcMar>
+          </w:tcPr>
+          <w:p>
+            <w:pPr>
+              <w:spacing w:after="0" w:line="240"/>
+            </w:pPr>
+            <w:r>
+              <w:rPr>
+                <w:sz w:val="19"/>
+                <w:szCs w:val="19"/>
+              </w:rPr>
+              <w:t xml:space="preserve">Diálogo desde Empleados</w:t>
+            </w:r>
+          </w:p>
+        </w:tc>
+        <w:tc>
+          <w:tcPr>
+            <w:tcW w:type="dxa" w:w="4760"/>
+            <w:tcMar>
+              <w:top w:type="dxa" w:w="80"/>
+              <w:left w:type="dxa" w:w="120"/>
+              <w:bottom w:type="dxa" w:w="80"/>
+              <w:right w:type="dxa" w:w="120"/>
+            </w:tcMar>
+          </w:tcPr>
+          <w:p>
+            <w:pPr>
+              <w:spacing w:after="0" w:line="240"/>
+            </w:pPr>
+            <w:r>
+              <w:rPr>
+                <w:sz w:val="19"/>
+                <w:szCs w:val="19"/>
+              </w:rPr>
+              <w:t xml:space="preserve">Alta y modificación del personal</w:t>
+            </w:r>
+          </w:p>
+        </w:tc>
+      </w:tr>
+    </w:tbl>
+    <w:p>
+      <w:pPr>
+        <w:pStyle w:val="Heading2"/>
+        <w:spacing w:after="140" w:before="280"/>
+      </w:pPr>
+      <w:r>
+        <w:t xml:space="preserve">7.2 Acceso</w:t>
       </w:r>
     </w:p>
     <w:p>
@@ -9363,7 +9550,7 @@
       <w:r>
         <w:drawing>
           <wp:inline distT="0" distB="0" distL="0" distR="0">
-            <wp:extent cx="5905500" cy="3600450"/>
+            <wp:extent cx="3619500" cy="2495550"/>
             <wp:effectExtent t="0" r="0" b="0" l="0"/>
             <wp:docPr id="1" name="" descr="" title=""/>
             <wp:cNvGraphicFramePr>
@@ -9388,7 +9575,7 @@
                   <pic:spPr bwMode="auto">
                     <a:xfrm>
                       <a:off x="0" y="0"/>
-                      <a:ext cx="5905500" cy="3600450"/>
+                      <a:ext cx="3619500" cy="2495550"/>
                     </a:xfrm>
                     <a:prstGeom prst="rect">
                       <a:avLst/>
@@ -9414,7 +9601,7 @@
           <w:sz w:val="18"/>
           <w:szCs w:val="18"/>
         </w:rPr>
-        <w:t xml:space="preserve">Figura 6. Catálogo. Búsqueda por coincidencia parcial y columnas ordenables.</w:t>
+        <w:t xml:space="preserve">Figura 6. Pantalla de acceso. El mensaje de error es el mismo para un correo inexistente y para una contraseña incorrecta, para no revelar cuál de los dos falló.</w:t>
       </w:r>
     </w:p>
     <w:p>
@@ -9423,7 +9610,7 @@
         <w:spacing w:after="140" w:before="280"/>
       </w:pPr>
       <w:r>
-        <w:t xml:space="preserve">7.4 Préstamos</w:t>
+        <w:t xml:space="preserve">7.3 Catálogo</w:t>
       </w:r>
     </w:p>
     <w:p>
@@ -9485,7 +9672,7 @@
           <w:sz w:val="18"/>
           <w:szCs w:val="18"/>
         </w:rPr>
-        <w:t xml:space="preserve">Figura 7. Préstamos abiertos. La situación de cada uno la calcula la base, no la pantalla.</w:t>
+        <w:t xml:space="preserve">Figura 7. Catálogo. Búsqueda por coincidencia parcial y columnas ordenables.</w:t>
       </w:r>
     </w:p>
     <w:p>
@@ -9494,31 +9681,7 @@
         <w:spacing w:after="140" w:before="280"/>
       </w:pPr>
       <w:r>
-        <w:t xml:space="preserve">7.5 Registrar un préstamo</w:t>
-      </w:r>
-    </w:p>
-    <w:p>
-      <w:pPr>
-        <w:spacing w:after="120" w:line="276"/>
-      </w:pPr>
-      <w:r>
-        <w:rPr>
-          <w:sz w:val="22"/>
-          <w:szCs w:val="22"/>
-        </w:rPr>
-        <w:t xml:space="preserve">Esta es la pantalla que define la usabilidad del sistema. La meta operativa acordada con la escuela es que registrar un préstamo tome menos de treinta segundos, buscando al alumno por nombre o por salón, sin llenar más de tres campos. Por eso no es un formulario: son dos búsquedas y un botón.</w:t>
-      </w:r>
-    </w:p>
-    <w:p>
-      <w:pPr>
-        <w:spacing w:after="120" w:line="276"/>
-      </w:pPr>
-      <w:r>
-        <w:rPr>
-          <w:sz w:val="22"/>
-          <w:szCs w:val="22"/>
-        </w:rPr>
-        <w:t xml:space="preserve">La búsqueda del alumno acepta indistintamente su nombre, su código o su salón, sin que el bibliotecario tenga que elegir antes en qué campo busca. El resumen anuncia el plazo, no una fecha: la fecha exacta la calcula la base al confirmar.</w:t>
+        <w:t xml:space="preserve">7.4 Préstamos</w:t>
       </w:r>
     </w:p>
     <w:p>
@@ -9529,7 +9692,7 @@
       <w:r>
         <w:drawing>
           <wp:inline distT="0" distB="0" distL="0" distR="0">
-            <wp:extent cx="4762500" cy="3133725"/>
+            <wp:extent cx="5905500" cy="3600450"/>
             <wp:effectExtent t="0" r="0" b="0" l="0"/>
             <wp:docPr id="1" name="" descr="" title=""/>
             <wp:cNvGraphicFramePr>
@@ -9554,7 +9717,7 @@
                   <pic:spPr bwMode="auto">
                     <a:xfrm>
                       <a:off x="0" y="0"/>
-                      <a:ext cx="4762500" cy="3133725"/>
+                      <a:ext cx="5905500" cy="3600450"/>
                     </a:xfrm>
                     <a:prstGeom prst="rect">
                       <a:avLst/>
@@ -9580,7 +9743,7 @@
           <w:sz w:val="18"/>
           <w:szCs w:val="18"/>
         </w:rPr>
-        <w:t xml:space="preserve">Figura 8. Diálogo de préstamo, con alumno y libro ya seleccionados.</w:t>
+        <w:t xml:space="preserve">Figura 8. Préstamos abiertos. La situación de cada uno la calcula la base, no la pantalla.</w:t>
       </w:r>
     </w:p>
     <w:p>
@@ -9589,7 +9752,31 @@
         <w:spacing w:after="140" w:before="280"/>
       </w:pPr>
       <w:r>
-        <w:t xml:space="preserve">7.6 Alumnos y deudores</w:t>
+        <w:t xml:space="preserve">7.5 Registrar un préstamo</w:t>
+      </w:r>
+    </w:p>
+    <w:p>
+      <w:pPr>
+        <w:spacing w:after="120" w:line="276"/>
+      </w:pPr>
+      <w:r>
+        <w:rPr>
+          <w:sz w:val="22"/>
+          <w:szCs w:val="22"/>
+        </w:rPr>
+        <w:t xml:space="preserve">Esta es la pantalla que define la usabilidad del sistema. La meta operativa acordada con la escuela es que registrar un préstamo tome menos de treinta segundos, buscando al alumno por nombre o por salón, sin llenar más de tres campos. Por eso no es un formulario: son dos búsquedas y un botón.</w:t>
+      </w:r>
+    </w:p>
+    <w:p>
+      <w:pPr>
+        <w:spacing w:after="120" w:line="276"/>
+      </w:pPr>
+      <w:r>
+        <w:rPr>
+          <w:sz w:val="22"/>
+          <w:szCs w:val="22"/>
+        </w:rPr>
+        <w:t xml:space="preserve">La búsqueda del alumno acepta indistintamente su nombre, su código o su salón, sin que el bibliotecario tenga que elegir antes en qué campo busca. El resumen anuncia el plazo, no una fecha: la fecha exacta la calcula la base al confirmar.</w:t>
       </w:r>
     </w:p>
     <w:p>
@@ -9600,7 +9787,7 @@
       <w:r>
         <w:drawing>
           <wp:inline distT="0" distB="0" distL="0" distR="0">
-            <wp:extent cx="5905500" cy="3600450"/>
+            <wp:extent cx="4762500" cy="3133725"/>
             <wp:effectExtent t="0" r="0" b="0" l="0"/>
             <wp:docPr id="1" name="" descr="" title=""/>
             <wp:cNvGraphicFramePr>
@@ -9625,7 +9812,7 @@
                   <pic:spPr bwMode="auto">
                     <a:xfrm>
                       <a:off x="0" y="0"/>
-                      <a:ext cx="5905500" cy="3600450"/>
+                      <a:ext cx="4762500" cy="3133725"/>
                     </a:xfrm>
                     <a:prstGeom prst="rect">
                       <a:avLst/>
@@ -9651,7 +9838,16 @@
           <w:sz w:val="18"/>
           <w:szCs w:val="18"/>
         </w:rPr>
-        <w:t xml:space="preserve">Figura 9. Padrón de alumnos.</w:t>
+        <w:t xml:space="preserve">Figura 9. Diálogo de préstamo, con alumno y libro ya seleccionados.</w:t>
+      </w:r>
+    </w:p>
+    <w:p>
+      <w:pPr>
+        <w:pStyle w:val="Heading2"/>
+        <w:spacing w:after="140" w:before="280"/>
+      </w:pPr>
+      <w:r>
+        <w:t xml:space="preserve">7.6 Alumnos y deudores</w:t>
       </w:r>
     </w:p>
     <w:p>
@@ -9713,16 +9909,7 @@
           <w:sz w:val="18"/>
           <w:szCs w:val="18"/>
         </w:rPr>
-        <w:t xml:space="preserve">Figura 10. Reporte de deudores. Se abre ya generado, sin pedir parámetros: el requisito pedía obtenerlo en un clic.</w:t>
-      </w:r>
-    </w:p>
-    <w:p>
-      <w:pPr>
-        <w:pStyle w:val="Heading2"/>
-        <w:spacing w:after="140" w:before="280"/>
-      </w:pPr>
-      <w:r>
-        <w:t xml:space="preserve">7.7 Empleados y captura</w:t>
+        <w:t xml:space="preserve">Figura 10. Padrón de alumnos.</w:t>
       </w:r>
     </w:p>
     <w:p>
@@ -9784,7 +9971,16 @@
           <w:sz w:val="18"/>
           <w:szCs w:val="18"/>
         </w:rPr>
-        <w:t xml:space="preserve">Figura 11. Plantilla del personal, con el puesto y el perfil de acceso de cada integrante.</w:t>
+        <w:t xml:space="preserve">Figura 11. Reporte de deudores. Se abre ya generado, sin pedir parámetros: el requisito pedía obtenerlo en un clic.</w:t>
+      </w:r>
+    </w:p>
+    <w:p>
+      <w:pPr>
+        <w:pStyle w:val="Heading2"/>
+        <w:spacing w:after="140" w:before="280"/>
+      </w:pPr>
+      <w:r>
+        <w:t xml:space="preserve">7.7 Empleados y captura</w:t>
       </w:r>
     </w:p>
     <w:p>
@@ -9795,7 +9991,7 @@
       <w:r>
         <w:drawing>
           <wp:inline distT="0" distB="0" distL="0" distR="0">
-            <wp:extent cx="3429000" cy="3133725"/>
+            <wp:extent cx="5905500" cy="3600450"/>
             <wp:effectExtent t="0" r="0" b="0" l="0"/>
             <wp:docPr id="1" name="" descr="" title=""/>
             <wp:cNvGraphicFramePr>
@@ -9820,6 +10016,68 @@
                   <pic:spPr bwMode="auto">
                     <a:xfrm>
                       <a:off x="0" y="0"/>
+                      <a:ext cx="5905500" cy="3600450"/>
+                    </a:xfrm>
+                    <a:prstGeom prst="rect">
+                      <a:avLst/>
+                    </a:prstGeom>
+                  </pic:spPr>
+                </pic:pic>
+              </a:graphicData>
+            </a:graphic>
+          </wp:inline>
+        </w:drawing>
+      </w:r>
+    </w:p>
+    <w:p>
+      <w:pPr>
+        <w:spacing w:after="220" w:line="276"/>
+        <w:jc w:val="center"/>
+      </w:pPr>
+      <w:r>
+        <w:rPr>
+          <w:i/>
+          <w:iCs/>
+          <w:color w:val="5D6675"/>
+          <w:sz w:val="18"/>
+          <w:szCs w:val="18"/>
+        </w:rPr>
+        <w:t xml:space="preserve">Figura 12. Plantilla del personal, con el puesto y el perfil de acceso de cada integrante.</w:t>
+      </w:r>
+    </w:p>
+    <w:p>
+      <w:pPr>
+        <w:spacing w:after="80" w:before="120"/>
+        <w:jc w:val="center"/>
+      </w:pPr>
+      <w:r>
+        <w:drawing>
+          <wp:inline distT="0" distB="0" distL="0" distR="0">
+            <wp:extent cx="3429000" cy="3133725"/>
+            <wp:effectExtent t="0" r="0" b="0" l="0"/>
+            <wp:docPr id="1" name="" descr="" title=""/>
+            <wp:cNvGraphicFramePr>
+              <a:graphicFrameLocks xmlns:a="http://schemas.openxmlformats.org/drawingml/2006/main" noChangeAspect="1"/>
+            </wp:cNvGraphicFramePr>
+            <a:graphic xmlns:a="http://schemas.openxmlformats.org/drawingml/2006/main">
+              <a:graphicData uri="http://schemas.openxmlformats.org/drawingml/2006/picture">
+                <pic:pic xmlns:pic="http://schemas.openxmlformats.org/drawingml/2006/picture">
+                  <pic:nvPicPr>
+                    <pic:cNvPr id="0" name="" descr=""/>
+                    <pic:cNvPicPr>
+                      <a:picLocks noChangeAspect="1" noChangeArrowheads="1"/>
+                    </pic:cNvPicPr>
+                  </pic:nvPicPr>
+                  <pic:blipFill>
+                    <a:blip r:embed="rId19" cstate="none"/>
+                    <a:srcRect/>
+                    <a:stretch>
+                      <a:fillRect/>
+                    </a:stretch>
+                  </pic:blipFill>
+                  <pic:spPr bwMode="auto">
+                    <a:xfrm>
+                      <a:off x="0" y="0"/>
                       <a:ext cx="3429000" cy="3133725"/>
                     </a:xfrm>
                     <a:prstGeom prst="rect">
@@ -9846,7 +10104,7 @@
           <w:sz w:val="18"/>
           <w:szCs w:val="18"/>
         </w:rPr>
-        <w:t xml:space="preserve">Figura 12. Formulario de alta de libro. Los campos obligatorios se marcan y los errores se explican bajo el formulario.</w:t>
+        <w:t xml:space="preserve">Figura 13. Formulario de alta de libro. Los campos obligatorios se marcan y los errores se explican bajo el formulario.</w:t>
       </w:r>
     </w:p>
     <w:p>

</xml_diff>

<commit_message>
Quitar la nota del indice y los pies de figura y de tabla
Diecisiete pies en total: quince de figura y dos de tabla. Las imagenes y las
tablas quedan sin rotulo, como el resto del documento.

Co-Authored-By: Claude Opus 5 <noreply@anthropic.com>
</commit_message>
<xml_diff>
--- a/Documentacion/Avance_Biblioteca_2.docx
+++ b/Documentacion/Avance_Biblioteca_2.docx
@@ -638,33 +638,6 @@
         </w:tc>
       </w:tr>
     </w:tbl>
-    <w:p>
-      <w:pPr>
-        <w:spacing w:after="160" w:line="276"/>
-      </w:pPr>
-      <w:r>
-        <w:rPr>
-          <w:sz w:val="22"/>
-          <w:szCs w:val="22"/>
-        </w:rPr>
-        <w:t xml:space="preserve"/>
-      </w:r>
-    </w:p>
-    <w:p>
-      <w:pPr>
-        <w:spacing w:after="120" w:line="276"/>
-      </w:pPr>
-      <w:r>
-        <w:rPr>
-          <w:i/>
-          <w:iCs/>
-          <w:color w:val="5D6675"/>
-          <w:sz w:val="20"/>
-          <w:szCs w:val="20"/>
-        </w:rPr>
-        <w:t xml:space="preserve">Este documento recoge únicamente el diseño del sistema. La planeación, el análisis y el estado de avance del proyecto están en el Avance 1 y sus actualizaciones.</w:t>
-      </w:r>
-    </w:p>
     <w:p>
       <w:r>
         <w:br w:type="page"/>
@@ -2190,22 +2163,6 @@
     </w:p>
     <w:p>
       <w:pPr>
-        <w:spacing w:after="220" w:line="276"/>
-        <w:jc w:val="center"/>
-      </w:pPr>
-      <w:r>
-        <w:rPr>
-          <w:i/>
-          <w:iCs/>
-          <w:color w:val="5D6675"/>
-          <w:sz w:val="18"/>
-          <w:szCs w:val="18"/>
-        </w:rPr>
-        <w:t xml:space="preserve">Figura 1. Diagrama de casos de uso. Frontera del sistema, tres actores y dieciséis casos de uso agrupados por módulo.</w:t>
-      </w:r>
-    </w:p>
-    <w:p>
-      <w:pPr>
         <w:spacing w:after="120" w:line="276"/>
       </w:pPr>
       <w:r>
@@ -5226,22 +5183,6 @@
     </w:p>
     <w:p>
       <w:pPr>
-        <w:spacing w:after="220" w:line="276"/>
-        <w:jc w:val="center"/>
-      </w:pPr>
-      <w:r>
-        <w:rPr>
-          <w:i/>
-          <w:iCs/>
-          <w:color w:val="5D6675"/>
-          <w:sz w:val="18"/>
-          <w:szCs w:val="18"/>
-        </w:rPr>
-        <w:t xml:space="preserve">Figura 2. Proceso de préstamo y de devolución, con las decisiones y los rechazos que aplica la base.</w:t>
-      </w:r>
-    </w:p>
-    <w:p>
-      <w:pPr>
         <w:pStyle w:val="Heading2"/>
         <w:spacing w:after="140" w:before="280"/>
       </w:pPr>
@@ -5412,22 +5353,6 @@
     </w:p>
     <w:p>
       <w:pPr>
-        <w:spacing w:after="220" w:line="276"/>
-        <w:jc w:val="center"/>
-      </w:pPr>
-      <w:r>
-        <w:rPr>
-          <w:i/>
-          <w:iCs/>
-          <w:color w:val="5D6675"/>
-          <w:sz w:val="18"/>
-          <w:szCs w:val="18"/>
-        </w:rPr>
-        <w:t xml:space="preserve">Figura 3. Modelo entidad-relación. Claves primarias subrayadas.</w:t>
-      </w:r>
-    </w:p>
-    <w:p>
-      <w:pPr>
         <w:spacing w:after="120" w:line="276"/>
       </w:pPr>
       <w:r>
@@ -5519,22 +5444,6 @@
     </w:p>
     <w:p>
       <w:pPr>
-        <w:spacing w:after="220" w:line="276"/>
-        <w:jc w:val="center"/>
-      </w:pPr>
-      <w:r>
-        <w:rPr>
-          <w:i/>
-          <w:iCs/>
-          <w:color w:val="5D6675"/>
-          <w:sz w:val="18"/>
-          <w:szCs w:val="18"/>
-        </w:rPr>
-        <w:t xml:space="preserve">Figura 4. Modelo relacional. Llave primaria subrayada, llave foránea en ámbar.</w:t>
-      </w:r>
-    </w:p>
-    <w:p>
-      <w:pPr>
         <w:spacing w:after="120" w:line="276"/>
       </w:pPr>
       <w:r>
@@ -7596,22 +7505,6 @@
         </w:tc>
       </w:tr>
     </w:tbl>
-    <w:p>
-      <w:pPr>
-        <w:spacing w:after="220" w:line="276"/>
-        <w:jc w:val="center"/>
-      </w:pPr>
-      <w:r>
-        <w:rPr>
-          <w:i/>
-          <w:iCs/>
-          <w:color w:val="5D6675"/>
-          <w:sz w:val="18"/>
-          <w:szCs w:val="18"/>
-        </w:rPr>
-        <w:t xml:space="preserve">Tabla 1. Estructura real, consultada del catálogo del sistema gestor el 22 de septiembre de 2026.</w:t>
-      </w:r>
-    </w:p>
     <w:p>
       <w:pPr>
         <w:spacing w:after="120" w:line="276"/>
@@ -7693,22 +7586,6 @@
     </w:p>
     <w:p>
       <w:pPr>
-        <w:spacing w:after="220" w:line="276"/>
-        <w:jc w:val="center"/>
-      </w:pPr>
-      <w:r>
-        <w:rPr>
-          <w:i/>
-          <w:iCs/>
-          <w:color w:val="5D6675"/>
-          <w:sz w:val="18"/>
-          <w:szCs w:val="18"/>
-        </w:rPr>
-        <w:t xml:space="preserve">Figura 5. Esquema en operación, capturado del panel del gestor.</w:t>
-      </w:r>
-    </w:p>
-    <w:p>
-      <w:pPr>
         <w:spacing w:after="120" w:line="276"/>
       </w:pPr>
       <w:r>
@@ -8573,22 +8450,6 @@
         </w:tc>
       </w:tr>
     </w:tbl>
-    <w:p>
-      <w:pPr>
-        <w:spacing w:after="220" w:line="276"/>
-        <w:jc w:val="center"/>
-      </w:pPr>
-      <w:r>
-        <w:rPr>
-          <w:i/>
-          <w:iCs/>
-          <w:color w:val="5D6675"/>
-          <w:sz w:val="18"/>
-          <w:szCs w:val="18"/>
-        </w:rPr>
-        <w:t xml:space="preserve">Tabla 2. Pruebas ejecutadas contra la base en operación.</w:t>
-      </w:r>
-    </w:p>
     <w:p>
       <w:r>
         <w:br w:type="page"/>
@@ -9590,22 +9451,6 @@
     </w:p>
     <w:p>
       <w:pPr>
-        <w:spacing w:after="220" w:line="276"/>
-        <w:jc w:val="center"/>
-      </w:pPr>
-      <w:r>
-        <w:rPr>
-          <w:i/>
-          <w:iCs/>
-          <w:color w:val="5D6675"/>
-          <w:sz w:val="18"/>
-          <w:szCs w:val="18"/>
-        </w:rPr>
-        <w:t xml:space="preserve">Figura 6. Pantalla de acceso. El mensaje de error es el mismo para un correo inexistente y para una contraseña incorrecta, para no revelar cuál de los dos falló.</w:t>
-      </w:r>
-    </w:p>
-    <w:p>
-      <w:pPr>
         <w:pStyle w:val="Heading2"/>
         <w:spacing w:after="140" w:before="280"/>
       </w:pPr>
@@ -9661,22 +9506,6 @@
     </w:p>
     <w:p>
       <w:pPr>
-        <w:spacing w:after="220" w:line="276"/>
-        <w:jc w:val="center"/>
-      </w:pPr>
-      <w:r>
-        <w:rPr>
-          <w:i/>
-          <w:iCs/>
-          <w:color w:val="5D6675"/>
-          <w:sz w:val="18"/>
-          <w:szCs w:val="18"/>
-        </w:rPr>
-        <w:t xml:space="preserve">Figura 7. Catálogo. Búsqueda por coincidencia parcial y columnas ordenables.</w:t>
-      </w:r>
-    </w:p>
-    <w:p>
-      <w:pPr>
         <w:pStyle w:val="Heading2"/>
         <w:spacing w:after="140" w:before="280"/>
       </w:pPr>
@@ -9732,22 +9561,6 @@
     </w:p>
     <w:p>
       <w:pPr>
-        <w:spacing w:after="220" w:line="276"/>
-        <w:jc w:val="center"/>
-      </w:pPr>
-      <w:r>
-        <w:rPr>
-          <w:i/>
-          <w:iCs/>
-          <w:color w:val="5D6675"/>
-          <w:sz w:val="18"/>
-          <w:szCs w:val="18"/>
-        </w:rPr>
-        <w:t xml:space="preserve">Figura 8. Préstamos abiertos. La situación de cada uno la calcula la base, no la pantalla.</w:t>
-      </w:r>
-    </w:p>
-    <w:p>
-      <w:pPr>
         <w:pStyle w:val="Heading2"/>
         <w:spacing w:after="140" w:before="280"/>
       </w:pPr>
@@ -9827,22 +9640,6 @@
     </w:p>
     <w:p>
       <w:pPr>
-        <w:spacing w:after="220" w:line="276"/>
-        <w:jc w:val="center"/>
-      </w:pPr>
-      <w:r>
-        <w:rPr>
-          <w:i/>
-          <w:iCs/>
-          <w:color w:val="5D6675"/>
-          <w:sz w:val="18"/>
-          <w:szCs w:val="18"/>
-        </w:rPr>
-        <w:t xml:space="preserve">Figura 9. Diálogo de préstamo, con alumno y libro ya seleccionados.</w:t>
-      </w:r>
-    </w:p>
-    <w:p>
-      <w:pPr>
         <w:pStyle w:val="Heading2"/>
         <w:spacing w:after="140" w:before="280"/>
       </w:pPr>
@@ -9898,22 +9695,6 @@
     </w:p>
     <w:p>
       <w:pPr>
-        <w:spacing w:after="220" w:line="276"/>
-        <w:jc w:val="center"/>
-      </w:pPr>
-      <w:r>
-        <w:rPr>
-          <w:i/>
-          <w:iCs/>
-          <w:color w:val="5D6675"/>
-          <w:sz w:val="18"/>
-          <w:szCs w:val="18"/>
-        </w:rPr>
-        <w:t xml:space="preserve">Figura 10. Padrón de alumnos.</w:t>
-      </w:r>
-    </w:p>
-    <w:p>
-      <w:pPr>
         <w:spacing w:after="80" w:before="120"/>
         <w:jc w:val="center"/>
       </w:pPr>
@@ -9960,22 +9741,6 @@
     </w:p>
     <w:p>
       <w:pPr>
-        <w:spacing w:after="220" w:line="276"/>
-        <w:jc w:val="center"/>
-      </w:pPr>
-      <w:r>
-        <w:rPr>
-          <w:i/>
-          <w:iCs/>
-          <w:color w:val="5D6675"/>
-          <w:sz w:val="18"/>
-          <w:szCs w:val="18"/>
-        </w:rPr>
-        <w:t xml:space="preserve">Figura 11. Reporte de deudores. Se abre ya generado, sin pedir parámetros: el requisito pedía obtenerlo en un clic.</w:t>
-      </w:r>
-    </w:p>
-    <w:p>
-      <w:pPr>
         <w:pStyle w:val="Heading2"/>
         <w:spacing w:after="140" w:before="280"/>
       </w:pPr>
@@ -10031,22 +9796,6 @@
     </w:p>
     <w:p>
       <w:pPr>
-        <w:spacing w:after="220" w:line="276"/>
-        <w:jc w:val="center"/>
-      </w:pPr>
-      <w:r>
-        <w:rPr>
-          <w:i/>
-          <w:iCs/>
-          <w:color w:val="5D6675"/>
-          <w:sz w:val="18"/>
-          <w:szCs w:val="18"/>
-        </w:rPr>
-        <w:t xml:space="preserve">Figura 12. Plantilla del personal, con el puesto y el perfil de acceso de cada integrante.</w:t>
-      </w:r>
-    </w:p>
-    <w:p>
-      <w:pPr>
         <w:spacing w:after="80" w:before="120"/>
         <w:jc w:val="center"/>
       </w:pPr>
@@ -10093,22 +9842,6 @@
     </w:p>
     <w:p>
       <w:pPr>
-        <w:spacing w:after="220" w:line="276"/>
-        <w:jc w:val="center"/>
-      </w:pPr>
-      <w:r>
-        <w:rPr>
-          <w:i/>
-          <w:iCs/>
-          <w:color w:val="5D6675"/>
-          <w:sz w:val="18"/>
-          <w:szCs w:val="18"/>
-        </w:rPr>
-        <w:t xml:space="preserve">Figura 13. Formulario de alta de libro. Los campos obligatorios se marcan y los errores se explican bajo el formulario.</w:t>
-      </w:r>
-    </w:p>
-    <w:p>
-      <w:pPr>
         <w:pStyle w:val="Heading2"/>
         <w:spacing w:after="140" w:before="280"/>
       </w:pPr>
@@ -13084,22 +12817,6 @@
     </w:tbl>
     <w:p>
       <w:pPr>
-        <w:spacing w:after="220" w:line="276"/>
-        <w:jc w:val="center"/>
-      </w:pPr>
-      <w:r>
-        <w:rPr>
-          <w:i/>
-          <w:iCs/>
-          <w:color w:val="5D6675"/>
-          <w:sz w:val="18"/>
-          <w:szCs w:val="18"/>
-        </w:rPr>
-        <w:t xml:space="preserve">Tabla 3. Trazabilidad de los requisitos funcionales.</w:t>
-      </w:r>
-    </w:p>
-    <w:p>
-      <w:pPr>
         <w:pStyle w:val="Heading2"/>
         <w:spacing w:after="140" w:before="280"/>
       </w:pPr>
@@ -14217,22 +13934,6 @@
         </w:tc>
       </w:tr>
     </w:tbl>
-    <w:p>
-      <w:pPr>
-        <w:spacing w:after="220" w:line="276"/>
-        <w:jc w:val="center"/>
-      </w:pPr>
-      <w:r>
-        <w:rPr>
-          <w:i/>
-          <w:iCs/>
-          <w:color w:val="5D6675"/>
-          <w:sz w:val="18"/>
-          <w:szCs w:val="18"/>
-        </w:rPr>
-        <w:t xml:space="preserve">Tabla 4. Trazabilidad de los requisitos no funcionales.</w:t>
-      </w:r>
-    </w:p>
     <w:p>
       <w:pPr>
         <w:pStyle w:val="Heading2"/>

</xml_diff>